<commit_message>
fix(marketing): remove doubled section dividers, fix table column widths
The generated .docx had two bugs: every "## " heading carried its own
bottom border AND the markdown's "---" divider right next to it also
rendered as a line, so most section breaks showed two stacked rules.
Now the heading and the divider don't both render when adjacent.

Also fixed the table column-width normalizer: the rounding-remainder
correction always landed on the last column, which could push it
below the readability floor (happened to the "Series" column in the
shot-priority table). Now the correction only touches columns that
have slack above the floor.
</commit_message>
<xml_diff>
--- a/src/knowledge/marketing/Lobsteria-Social-Media-Brand-Bible.docx
+++ b/src/knowledge/marketing/Lobsteria-Social-Media-Brand-Bible.docx
@@ -5,7 +5,7 @@
     <w:p>
       <w:pPr>
         <w:pStyle w:val="Title"/>
-        <w:spacing w:after="120"/>
+        <w:spacing w:after="80"/>
         <w:jc w:val="left"/>
       </w:pPr>
       <w:r>
@@ -14,43 +14,38 @@
     </w:p>
     <w:p>
       <w:pPr>
-        <w:spacing w:after="160"/>
+        <w:spacing w:after="40"/>
       </w:pPr>
       <w:r>
         <w:rPr>
           <w:i/>
           <w:iCs/>
+          <w:color w:val="666666"/>
+          <w:sz w:val="20"/>
+          <w:szCs w:val="20"/>
         </w:rPr>
         <w:t xml:space="preserve">The definitive reference for how Lobsteria shows up in the world.</w:t>
       </w:r>
     </w:p>
     <w:p>
       <w:pPr>
-        <w:spacing w:after="160"/>
+        <w:spacing w:after="40"/>
       </w:pPr>
       <w:r>
         <w:rPr>
           <w:i/>
           <w:iCs/>
+          <w:color w:val="666666"/>
+          <w:sz w:val="20"/>
+          <w:szCs w:val="20"/>
         </w:rPr>
         <w:t xml:space="preserve">Last updated: May 2026. Written after studying @homerfoodgroup, @ganasdevicio, @grab.sandwiches, @myka_greek.usa</w:t>
       </w:r>
     </w:p>
     <w:p>
       <w:pPr>
-        <w:pBdr>
-          <w:bottom w:val="single" w:color="C9A24B" w:sz="6"/>
-        </w:pBdr>
-        <w:spacing w:after="200" w:before="200"/>
-      </w:pPr>
-    </w:p>
-    <w:p>
-      <w:pPr>
         <w:pStyle w:val="Heading1"/>
-        <w:pBdr>
-          <w:bottom w:val="single" w:color="1A1A2E" w:sz="4"/>
-        </w:pBdr>
-        <w:spacing w:after="160" w:before="360"/>
+        <w:spacing w:after="160" w:before="400"/>
       </w:pPr>
       <w:r>
         <w:t xml:space="preserve">THE ONE THING</w:t>
@@ -102,19 +97,8 @@
     </w:p>
     <w:p>
       <w:pPr>
-        <w:pBdr>
-          <w:bottom w:val="single" w:color="C9A24B" w:sz="6"/>
-        </w:pBdr>
-        <w:spacing w:after="200" w:before="200"/>
-      </w:pPr>
-    </w:p>
-    <w:p>
-      <w:pPr>
         <w:pStyle w:val="Heading1"/>
-        <w:pBdr>
-          <w:bottom w:val="single" w:color="1A1A2E" w:sz="4"/>
-        </w:pBdr>
-        <w:spacing w:after="160" w:before="360"/>
+        <w:spacing w:after="160" w:before="400"/>
       </w:pPr>
       <w:r>
         <w:t xml:space="preserve">THE BRAND TRUTH</w:t>
@@ -190,19 +174,8 @@
     </w:p>
     <w:p>
       <w:pPr>
-        <w:pBdr>
-          <w:bottom w:val="single" w:color="C9A24B" w:sz="6"/>
-        </w:pBdr>
-        <w:spacing w:after="200" w:before="200"/>
-      </w:pPr>
-    </w:p>
-    <w:p>
-      <w:pPr>
         <w:pStyle w:val="Heading1"/>
-        <w:pBdr>
-          <w:bottom w:val="single" w:color="1A1A2E" w:sz="4"/>
-        </w:pBdr>
-        <w:spacing w:after="160" w:before="360"/>
+        <w:spacing w:after="160" w:before="400"/>
       </w:pPr>
       <w:r>
         <w:t xml:space="preserve">PAU — THE CHARACTER</w:t>
@@ -457,19 +430,8 @@
     </w:p>
     <w:p>
       <w:pPr>
-        <w:pBdr>
-          <w:bottom w:val="single" w:color="C9A24B" w:sz="6"/>
-        </w:pBdr>
-        <w:spacing w:after="200" w:before="200"/>
-      </w:pPr>
-    </w:p>
-    <w:p>
-      <w:pPr>
         <w:pStyle w:val="Heading1"/>
-        <w:pBdr>
-          <w:bottom w:val="single" w:color="1A1A2E" w:sz="4"/>
-        </w:pBdr>
-        <w:spacing w:after="160" w:before="360"/>
+        <w:spacing w:after="160" w:before="400"/>
       </w:pPr>
       <w:r>
         <w:t xml:space="preserve">THE AUDIENCE</w:t>
@@ -614,19 +576,8 @@
     </w:p>
     <w:p>
       <w:pPr>
-        <w:pBdr>
-          <w:bottom w:val="single" w:color="C9A24B" w:sz="6"/>
-        </w:pBdr>
-        <w:spacing w:after="200" w:before="200"/>
-      </w:pPr>
-    </w:p>
-    <w:p>
-      <w:pPr>
         <w:pStyle w:val="Heading1"/>
-        <w:pBdr>
-          <w:bottom w:val="single" w:color="1A1A2E" w:sz="4"/>
-        </w:pBdr>
-        <w:spacing w:after="160" w:before="360"/>
+        <w:spacing w:after="160" w:before="400"/>
       </w:pPr>
       <w:r>
         <w:t xml:space="preserve">CONTENT PILLARS</w:t>
@@ -776,14 +727,6 @@
     </w:p>
     <w:p>
       <w:pPr>
-        <w:pBdr>
-          <w:bottom w:val="single" w:color="C9A24B" w:sz="6"/>
-        </w:pBdr>
-        <w:spacing w:after="200" w:before="200"/>
-      </w:pPr>
-    </w:p>
-    <w:p>
-      <w:pPr>
         <w:pStyle w:val="Heading2"/>
         <w:spacing w:after="120" w:before="280"/>
       </w:pPr>
@@ -926,14 +869,6 @@
     </w:p>
     <w:p>
       <w:pPr>
-        <w:pBdr>
-          <w:bottom w:val="single" w:color="C9A24B" w:sz="6"/>
-        </w:pBdr>
-        <w:spacing w:after="200" w:before="200"/>
-      </w:pPr>
-    </w:p>
-    <w:p>
-      <w:pPr>
         <w:pStyle w:val="Heading2"/>
         <w:spacing w:after="120" w:before="280"/>
       </w:pPr>
@@ -1089,14 +1024,6 @@
     </w:p>
     <w:p>
       <w:pPr>
-        <w:pBdr>
-          <w:bottom w:val="single" w:color="C9A24B" w:sz="6"/>
-        </w:pBdr>
-        <w:spacing w:after="200" w:before="200"/>
-      </w:pPr>
-    </w:p>
-    <w:p>
-      <w:pPr>
         <w:pStyle w:val="Heading2"/>
         <w:spacing w:after="120" w:before="280"/>
       </w:pPr>
@@ -1239,19 +1166,8 @@
     </w:p>
     <w:p>
       <w:pPr>
-        <w:pBdr>
-          <w:bottom w:val="single" w:color="C9A24B" w:sz="6"/>
-        </w:pBdr>
-        <w:spacing w:after="200" w:before="200"/>
-      </w:pPr>
-    </w:p>
-    <w:p>
-      <w:pPr>
         <w:pStyle w:val="Heading1"/>
-        <w:pBdr>
-          <w:bottom w:val="single" w:color="1A1A2E" w:sz="4"/>
-        </w:pBdr>
-        <w:spacing w:after="160" w:before="360"/>
+        <w:spacing w:after="160" w:before="400"/>
       </w:pPr>
       <w:r>
         <w:t xml:space="preserve">CONTENT FORMATS</w:t>
@@ -1361,14 +1277,6 @@
     </w:p>
     <w:p>
       <w:pPr>
-        <w:pBdr>
-          <w:bottom w:val="single" w:color="C9A24B" w:sz="6"/>
-        </w:pBdr>
-        <w:spacing w:after="200" w:before="200"/>
-      </w:pPr>
-    </w:p>
-    <w:p>
-      <w:pPr>
         <w:pStyle w:val="Heading2"/>
         <w:spacing w:after="120" w:before="280"/>
       </w:pPr>
@@ -1458,14 +1366,6 @@
     </w:p>
     <w:p>
       <w:pPr>
-        <w:pBdr>
-          <w:bottom w:val="single" w:color="C9A24B" w:sz="6"/>
-        </w:pBdr>
-        <w:spacing w:after="200" w:before="200"/>
-      </w:pPr>
-    </w:p>
-    <w:p>
-      <w:pPr>
         <w:pStyle w:val="Heading2"/>
         <w:spacing w:after="120" w:before="280"/>
       </w:pPr>
@@ -1491,14 +1391,6 @@
     </w:p>
     <w:p>
       <w:pPr>
-        <w:pBdr>
-          <w:bottom w:val="single" w:color="C9A24B" w:sz="6"/>
-        </w:pBdr>
-        <w:spacing w:after="200" w:before="200"/>
-      </w:pPr>
-    </w:p>
-    <w:p>
-      <w:pPr>
         <w:pStyle w:val="Heading2"/>
         <w:spacing w:after="120" w:before="280"/>
       </w:pPr>
@@ -1584,19 +1476,8 @@
     </w:p>
     <w:p>
       <w:pPr>
-        <w:pBdr>
-          <w:bottom w:val="single" w:color="C9A24B" w:sz="6"/>
-        </w:pBdr>
-        <w:spacing w:after="200" w:before="200"/>
-      </w:pPr>
-    </w:p>
-    <w:p>
-      <w:pPr>
         <w:pStyle w:val="Heading1"/>
-        <w:pBdr>
-          <w:bottom w:val="single" w:color="1A1A2E" w:sz="4"/>
-        </w:pBdr>
-        <w:spacing w:after="160" w:before="360"/>
+        <w:spacing w:after="160" w:before="400"/>
       </w:pPr>
       <w:r>
         <w:t xml:space="preserve">THE FIVE SERIES</w:t>
@@ -1748,14 +1629,6 @@
     </w:p>
     <w:p>
       <w:pPr>
-        <w:pBdr>
-          <w:bottom w:val="single" w:color="C9A24B" w:sz="6"/>
-        </w:pBdr>
-        <w:spacing w:after="200" w:before="200"/>
-      </w:pPr>
-    </w:p>
-    <w:p>
-      <w:pPr>
         <w:pStyle w:val="Heading2"/>
         <w:spacing w:after="120" w:before="280"/>
       </w:pPr>
@@ -1866,14 +1739,6 @@
     </w:p>
     <w:p>
       <w:pPr>
-        <w:pBdr>
-          <w:bottom w:val="single" w:color="C9A24B" w:sz="6"/>
-        </w:pBdr>
-        <w:spacing w:after="200" w:before="200"/>
-      </w:pPr>
-    </w:p>
-    <w:p>
-      <w:pPr>
         <w:pStyle w:val="Heading2"/>
         <w:spacing w:after="120" w:before="280"/>
       </w:pPr>
@@ -1919,14 +1784,6 @@
     </w:p>
     <w:p>
       <w:pPr>
-        <w:pBdr>
-          <w:bottom w:val="single" w:color="C9A24B" w:sz="6"/>
-        </w:pBdr>
-        <w:spacing w:after="200" w:before="200"/>
-      </w:pPr>
-    </w:p>
-    <w:p>
-      <w:pPr>
         <w:pStyle w:val="Heading2"/>
         <w:spacing w:after="120" w:before="280"/>
       </w:pPr>
@@ -2024,14 +1881,6 @@
     </w:p>
     <w:p>
       <w:pPr>
-        <w:pBdr>
-          <w:bottom w:val="single" w:color="C9A24B" w:sz="6"/>
-        </w:pBdr>
-        <w:spacing w:after="200" w:before="200"/>
-      </w:pPr>
-    </w:p>
-    <w:p>
-      <w:pPr>
         <w:pStyle w:val="Heading2"/>
         <w:spacing w:after="120" w:before="280"/>
       </w:pPr>
@@ -2137,19 +1986,8 @@
     </w:p>
     <w:p>
       <w:pPr>
-        <w:pBdr>
-          <w:bottom w:val="single" w:color="C9A24B" w:sz="6"/>
-        </w:pBdr>
-        <w:spacing w:after="200" w:before="200"/>
-      </w:pPr>
-    </w:p>
-    <w:p>
-      <w:pPr>
         <w:pStyle w:val="Heading1"/>
-        <w:pBdr>
-          <w:bottom w:val="single" w:color="1A1A2E" w:sz="4"/>
-        </w:pBdr>
-        <w:spacing w:after="160" w:before="360"/>
+        <w:spacing w:after="160" w:before="400"/>
       </w:pPr>
       <w:r>
         <w:t xml:space="preserve">VISUAL &amp; AUDIO IDENTITY</w:t>
@@ -2415,19 +2253,8 @@
     </w:p>
     <w:p>
       <w:pPr>
-        <w:pBdr>
-          <w:bottom w:val="single" w:color="C9A24B" w:sz="6"/>
-        </w:pBdr>
-        <w:spacing w:after="200" w:before="200"/>
-      </w:pPr>
-    </w:p>
-    <w:p>
-      <w:pPr>
         <w:pStyle w:val="Heading1"/>
-        <w:pBdr>
-          <w:bottom w:val="single" w:color="1A1A2E" w:sz="4"/>
-        </w:pBdr>
-        <w:spacing w:after="160" w:before="360"/>
+        <w:spacing w:after="160" w:before="400"/>
       </w:pPr>
       <w:r>
         <w:t xml:space="preserve">PLATFORM STRATEGY</w:t>
@@ -2664,19 +2491,8 @@
     </w:p>
     <w:p>
       <w:pPr>
-        <w:pBdr>
-          <w:bottom w:val="single" w:color="C9A24B" w:sz="6"/>
-        </w:pBdr>
-        <w:spacing w:after="200" w:before="200"/>
-      </w:pPr>
-    </w:p>
-    <w:p>
-      <w:pPr>
         <w:pStyle w:val="Heading1"/>
-        <w:pBdr>
-          <w:bottom w:val="single" w:color="1A1A2E" w:sz="4"/>
-        </w:pBdr>
-        <w:spacing w:after="160" w:before="360"/>
+        <w:spacing w:after="160" w:before="400"/>
       </w:pPr>
       <w:r>
         <w:t xml:space="preserve">CAPTION RULES</w:t>
@@ -2969,19 +2785,8 @@
     </w:p>
     <w:p>
       <w:pPr>
-        <w:pBdr>
-          <w:bottom w:val="single" w:color="C9A24B" w:sz="6"/>
-        </w:pBdr>
-        <w:spacing w:after="200" w:before="200"/>
-      </w:pPr>
-    </w:p>
-    <w:p>
-      <w:pPr>
         <w:pStyle w:val="Heading1"/>
-        <w:pBdr>
-          <w:bottom w:val="single" w:color="1A1A2E" w:sz="4"/>
-        </w:pBdr>
-        <w:spacing w:after="160" w:before="360"/>
+        <w:spacing w:after="160" w:before="400"/>
       </w:pPr>
       <w:r>
         <w:t xml:space="preserve">THE RULES — WHAT LOBSTERIA NEVER DOES</w:t>
@@ -3149,19 +2954,8 @@
     </w:p>
     <w:p>
       <w:pPr>
-        <w:pBdr>
-          <w:bottom w:val="single" w:color="C9A24B" w:sz="6"/>
-        </w:pBdr>
-        <w:spacing w:after="200" w:before="200"/>
-      </w:pPr>
-    </w:p>
-    <w:p>
-      <w:pPr>
         <w:pStyle w:val="Heading1"/>
-        <w:pBdr>
-          <w:bottom w:val="single" w:color="1A1A2E" w:sz="4"/>
-        </w:pBdr>
-        <w:spacing w:after="160" w:before="360"/>
+        <w:spacing w:after="160" w:before="400"/>
       </w:pPr>
       <w:r>
         <w:t xml:space="preserve">THE VIRAL PATH — MILESTONE BY MILESTONE</w:t>
@@ -3629,19 +3423,8 @@
     </w:p>
     <w:p>
       <w:pPr>
-        <w:pBdr>
-          <w:bottom w:val="single" w:color="C9A24B" w:sz="6"/>
-        </w:pBdr>
-        <w:spacing w:after="200" w:before="200"/>
-      </w:pPr>
-    </w:p>
-    <w:p>
-      <w:pPr>
         <w:pStyle w:val="Heading1"/>
-        <w:pBdr>
-          <w:bottom w:val="single" w:color="1A1A2E" w:sz="4"/>
-        </w:pBdr>
-        <w:spacing w:after="160" w:before="360"/>
+        <w:spacing w:after="160" w:before="400"/>
       </w:pPr>
       <w:r>
         <w:t xml:space="preserve">WHAT TO SHOOT — IN ORDER OF PRIORITY</w:t>
@@ -3668,21 +3451,21 @@
         </w:tblBorders>
       </w:tblPr>
       <w:tblGrid>
-        <w:gridCol w:w="2250"/>
-        <w:gridCol w:w="2250"/>
-        <w:gridCol w:w="2250"/>
-        <w:gridCol w:w="2250"/>
+        <w:gridCol w:w="1300"/>
+        <w:gridCol w:w="4938"/>
+        <w:gridCol w:w="1300"/>
+        <w:gridCol w:w="1462"/>
       </w:tblGrid>
       <w:tr>
         <w:tc>
           <w:tcPr>
-            <w:tcW w:type="dxa" w:w="2250"/>
+            <w:tcW w:type="dxa" w:w="1300"/>
             <w:shd w:fill="1A1A2E" w:color="auto" w:val="clear"/>
             <w:tcMar>
-              <w:top w:type="dxa" w:w="80"/>
-              <w:left w:type="dxa" w:w="100"/>
-              <w:bottom w:type="dxa" w:w="80"/>
-              <w:right w:type="dxa" w:w="100"/>
+              <w:top w:type="dxa" w:w="100"/>
+              <w:left w:type="dxa" w:w="120"/>
+              <w:bottom w:type="dxa" w:w="100"/>
+              <w:right w:type="dxa" w:w="120"/>
             </w:tcMar>
           </w:tcPr>
           <w:p>
@@ -3700,13 +3483,13 @@
         </w:tc>
         <w:tc>
           <w:tcPr>
-            <w:tcW w:type="dxa" w:w="2250"/>
+            <w:tcW w:type="dxa" w:w="4938"/>
             <w:shd w:fill="1A1A2E" w:color="auto" w:val="clear"/>
             <w:tcMar>
-              <w:top w:type="dxa" w:w="80"/>
-              <w:left w:type="dxa" w:w="100"/>
-              <w:bottom w:type="dxa" w:w="80"/>
-              <w:right w:type="dxa" w:w="100"/>
+              <w:top w:type="dxa" w:w="100"/>
+              <w:left w:type="dxa" w:w="120"/>
+              <w:bottom w:type="dxa" w:w="100"/>
+              <w:right w:type="dxa" w:w="120"/>
             </w:tcMar>
           </w:tcPr>
           <w:p>
@@ -3724,13 +3507,13 @@
         </w:tc>
         <w:tc>
           <w:tcPr>
-            <w:tcW w:type="dxa" w:w="2250"/>
+            <w:tcW w:type="dxa" w:w="1300"/>
             <w:shd w:fill="1A1A2E" w:color="auto" w:val="clear"/>
             <w:tcMar>
-              <w:top w:type="dxa" w:w="80"/>
-              <w:left w:type="dxa" w:w="100"/>
-              <w:bottom w:type="dxa" w:w="80"/>
-              <w:right w:type="dxa" w:w="100"/>
+              <w:top w:type="dxa" w:w="100"/>
+              <w:left w:type="dxa" w:w="120"/>
+              <w:bottom w:type="dxa" w:w="100"/>
+              <w:right w:type="dxa" w:w="120"/>
             </w:tcMar>
           </w:tcPr>
           <w:p>
@@ -3748,13 +3531,13 @@
         </w:tc>
         <w:tc>
           <w:tcPr>
-            <w:tcW w:type="dxa" w:w="2250"/>
+            <w:tcW w:type="dxa" w:w="1462"/>
             <w:shd w:fill="1A1A2E" w:color="auto" w:val="clear"/>
             <w:tcMar>
-              <w:top w:type="dxa" w:w="80"/>
-              <w:left w:type="dxa" w:w="100"/>
-              <w:bottom w:type="dxa" w:w="80"/>
-              <w:right w:type="dxa" w:w="100"/>
+              <w:top w:type="dxa" w:w="100"/>
+              <w:left w:type="dxa" w:w="120"/>
+              <w:bottom w:type="dxa" w:w="100"/>
+              <w:right w:type="dxa" w:w="120"/>
             </w:tcMar>
           </w:tcPr>
           <w:p>
@@ -3774,12 +3557,12 @@
       <w:tr>
         <w:tc>
           <w:tcPr>
-            <w:tcW w:type="dxa" w:w="2250"/>
-            <w:tcMar>
-              <w:top w:type="dxa" w:w="80"/>
-              <w:left w:type="dxa" w:w="100"/>
-              <w:bottom w:type="dxa" w:w="80"/>
-              <w:right w:type="dxa" w:w="100"/>
+            <w:tcW w:type="dxa" w:w="1300"/>
+            <w:tcMar>
+              <w:top w:type="dxa" w:w="100"/>
+              <w:left w:type="dxa" w:w="120"/>
+              <w:bottom w:type="dxa" w:w="100"/>
+              <w:right w:type="dxa" w:w="120"/>
             </w:tcMar>
           </w:tcPr>
           <w:p>
@@ -3796,12 +3579,12 @@
         </w:tc>
         <w:tc>
           <w:tcPr>
-            <w:tcW w:type="dxa" w:w="2250"/>
-            <w:tcMar>
-              <w:top w:type="dxa" w:w="80"/>
-              <w:left w:type="dxa" w:w="100"/>
-              <w:bottom w:type="dxa" w:w="80"/>
-              <w:right w:type="dxa" w:w="100"/>
+            <w:tcW w:type="dxa" w:w="4938"/>
+            <w:tcMar>
+              <w:top w:type="dxa" w:w="100"/>
+              <w:left w:type="dxa" w:w="120"/>
+              <w:bottom w:type="dxa" w:w="100"/>
+              <w:right w:type="dxa" w:w="120"/>
             </w:tcMar>
           </w:tcPr>
           <w:p>
@@ -3818,12 +3601,12 @@
         </w:tc>
         <w:tc>
           <w:tcPr>
-            <w:tcW w:type="dxa" w:w="2250"/>
-            <w:tcMar>
-              <w:top w:type="dxa" w:w="80"/>
-              <w:left w:type="dxa" w:w="100"/>
-              <w:bottom w:type="dxa" w:w="80"/>
-              <w:right w:type="dxa" w:w="100"/>
+            <w:tcW w:type="dxa" w:w="1300"/>
+            <w:tcMar>
+              <w:top w:type="dxa" w:w="100"/>
+              <w:left w:type="dxa" w:w="120"/>
+              <w:bottom w:type="dxa" w:w="100"/>
+              <w:right w:type="dxa" w:w="120"/>
             </w:tcMar>
           </w:tcPr>
           <w:p>
@@ -3840,12 +3623,12 @@
         </w:tc>
         <w:tc>
           <w:tcPr>
-            <w:tcW w:type="dxa" w:w="2250"/>
-            <w:tcMar>
-              <w:top w:type="dxa" w:w="80"/>
-              <w:left w:type="dxa" w:w="100"/>
-              <w:bottom w:type="dxa" w:w="80"/>
-              <w:right w:type="dxa" w:w="100"/>
+            <w:tcW w:type="dxa" w:w="1462"/>
+            <w:tcMar>
+              <w:top w:type="dxa" w:w="100"/>
+              <w:left w:type="dxa" w:w="120"/>
+              <w:bottom w:type="dxa" w:w="100"/>
+              <w:right w:type="dxa" w:w="120"/>
             </w:tcMar>
           </w:tcPr>
           <w:p>
@@ -3864,12 +3647,12 @@
       <w:tr>
         <w:tc>
           <w:tcPr>
-            <w:tcW w:type="dxa" w:w="2250"/>
-            <w:tcMar>
-              <w:top w:type="dxa" w:w="80"/>
-              <w:left w:type="dxa" w:w="100"/>
-              <w:bottom w:type="dxa" w:w="80"/>
-              <w:right w:type="dxa" w:w="100"/>
+            <w:tcW w:type="dxa" w:w="1300"/>
+            <w:tcMar>
+              <w:top w:type="dxa" w:w="100"/>
+              <w:left w:type="dxa" w:w="120"/>
+              <w:bottom w:type="dxa" w:w="100"/>
+              <w:right w:type="dxa" w:w="120"/>
             </w:tcMar>
           </w:tcPr>
           <w:p>
@@ -3886,12 +3669,12 @@
         </w:tc>
         <w:tc>
           <w:tcPr>
-            <w:tcW w:type="dxa" w:w="2250"/>
-            <w:tcMar>
-              <w:top w:type="dxa" w:w="80"/>
-              <w:left w:type="dxa" w:w="100"/>
-              <w:bottom w:type="dxa" w:w="80"/>
-              <w:right w:type="dxa" w:w="100"/>
+            <w:tcW w:type="dxa" w:w="4938"/>
+            <w:tcMar>
+              <w:top w:type="dxa" w:w="100"/>
+              <w:left w:type="dxa" w:w="120"/>
+              <w:bottom w:type="dxa" w:w="100"/>
+              <w:right w:type="dxa" w:w="120"/>
             </w:tcMar>
           </w:tcPr>
           <w:p>
@@ -3908,12 +3691,12 @@
         </w:tc>
         <w:tc>
           <w:tcPr>
-            <w:tcW w:type="dxa" w:w="2250"/>
-            <w:tcMar>
-              <w:top w:type="dxa" w:w="80"/>
-              <w:left w:type="dxa" w:w="100"/>
-              <w:bottom w:type="dxa" w:w="80"/>
-              <w:right w:type="dxa" w:w="100"/>
+            <w:tcW w:type="dxa" w:w="1300"/>
+            <w:tcMar>
+              <w:top w:type="dxa" w:w="100"/>
+              <w:left w:type="dxa" w:w="120"/>
+              <w:bottom w:type="dxa" w:w="100"/>
+              <w:right w:type="dxa" w:w="120"/>
             </w:tcMar>
           </w:tcPr>
           <w:p>
@@ -3930,12 +3713,12 @@
         </w:tc>
         <w:tc>
           <w:tcPr>
-            <w:tcW w:type="dxa" w:w="2250"/>
-            <w:tcMar>
-              <w:top w:type="dxa" w:w="80"/>
-              <w:left w:type="dxa" w:w="100"/>
-              <w:bottom w:type="dxa" w:w="80"/>
-              <w:right w:type="dxa" w:w="100"/>
+            <w:tcW w:type="dxa" w:w="1462"/>
+            <w:tcMar>
+              <w:top w:type="dxa" w:w="100"/>
+              <w:left w:type="dxa" w:w="120"/>
+              <w:bottom w:type="dxa" w:w="100"/>
+              <w:right w:type="dxa" w:w="120"/>
             </w:tcMar>
           </w:tcPr>
           <w:p>
@@ -3954,12 +3737,12 @@
       <w:tr>
         <w:tc>
           <w:tcPr>
-            <w:tcW w:type="dxa" w:w="2250"/>
-            <w:tcMar>
-              <w:top w:type="dxa" w:w="80"/>
-              <w:left w:type="dxa" w:w="100"/>
-              <w:bottom w:type="dxa" w:w="80"/>
-              <w:right w:type="dxa" w:w="100"/>
+            <w:tcW w:type="dxa" w:w="1300"/>
+            <w:tcMar>
+              <w:top w:type="dxa" w:w="100"/>
+              <w:left w:type="dxa" w:w="120"/>
+              <w:bottom w:type="dxa" w:w="100"/>
+              <w:right w:type="dxa" w:w="120"/>
             </w:tcMar>
           </w:tcPr>
           <w:p>
@@ -3976,12 +3759,12 @@
         </w:tc>
         <w:tc>
           <w:tcPr>
-            <w:tcW w:type="dxa" w:w="2250"/>
-            <w:tcMar>
-              <w:top w:type="dxa" w:w="80"/>
-              <w:left w:type="dxa" w:w="100"/>
-              <w:bottom w:type="dxa" w:w="80"/>
-              <w:right w:type="dxa" w:w="100"/>
+            <w:tcW w:type="dxa" w:w="4938"/>
+            <w:tcMar>
+              <w:top w:type="dxa" w:w="100"/>
+              <w:left w:type="dxa" w:w="120"/>
+              <w:bottom w:type="dxa" w:w="100"/>
+              <w:right w:type="dxa" w:w="120"/>
             </w:tcMar>
           </w:tcPr>
           <w:p>
@@ -3998,12 +3781,12 @@
         </w:tc>
         <w:tc>
           <w:tcPr>
-            <w:tcW w:type="dxa" w:w="2250"/>
-            <w:tcMar>
-              <w:top w:type="dxa" w:w="80"/>
-              <w:left w:type="dxa" w:w="100"/>
-              <w:bottom w:type="dxa" w:w="80"/>
-              <w:right w:type="dxa" w:w="100"/>
+            <w:tcW w:type="dxa" w:w="1300"/>
+            <w:tcMar>
+              <w:top w:type="dxa" w:w="100"/>
+              <w:left w:type="dxa" w:w="120"/>
+              <w:bottom w:type="dxa" w:w="100"/>
+              <w:right w:type="dxa" w:w="120"/>
             </w:tcMar>
           </w:tcPr>
           <w:p>
@@ -4020,12 +3803,12 @@
         </w:tc>
         <w:tc>
           <w:tcPr>
-            <w:tcW w:type="dxa" w:w="2250"/>
-            <w:tcMar>
-              <w:top w:type="dxa" w:w="80"/>
-              <w:left w:type="dxa" w:w="100"/>
-              <w:bottom w:type="dxa" w:w="80"/>
-              <w:right w:type="dxa" w:w="100"/>
+            <w:tcW w:type="dxa" w:w="1462"/>
+            <w:tcMar>
+              <w:top w:type="dxa" w:w="100"/>
+              <w:left w:type="dxa" w:w="120"/>
+              <w:bottom w:type="dxa" w:w="100"/>
+              <w:right w:type="dxa" w:w="120"/>
             </w:tcMar>
           </w:tcPr>
           <w:p>
@@ -4044,12 +3827,12 @@
       <w:tr>
         <w:tc>
           <w:tcPr>
-            <w:tcW w:type="dxa" w:w="2250"/>
-            <w:tcMar>
-              <w:top w:type="dxa" w:w="80"/>
-              <w:left w:type="dxa" w:w="100"/>
-              <w:bottom w:type="dxa" w:w="80"/>
-              <w:right w:type="dxa" w:w="100"/>
+            <w:tcW w:type="dxa" w:w="1300"/>
+            <w:tcMar>
+              <w:top w:type="dxa" w:w="100"/>
+              <w:left w:type="dxa" w:w="120"/>
+              <w:bottom w:type="dxa" w:w="100"/>
+              <w:right w:type="dxa" w:w="120"/>
             </w:tcMar>
           </w:tcPr>
           <w:p>
@@ -4066,12 +3849,12 @@
         </w:tc>
         <w:tc>
           <w:tcPr>
-            <w:tcW w:type="dxa" w:w="2250"/>
-            <w:tcMar>
-              <w:top w:type="dxa" w:w="80"/>
-              <w:left w:type="dxa" w:w="100"/>
-              <w:bottom w:type="dxa" w:w="80"/>
-              <w:right w:type="dxa" w:w="100"/>
+            <w:tcW w:type="dxa" w:w="4938"/>
+            <w:tcMar>
+              <w:top w:type="dxa" w:w="100"/>
+              <w:left w:type="dxa" w:w="120"/>
+              <w:bottom w:type="dxa" w:w="100"/>
+              <w:right w:type="dxa" w:w="120"/>
             </w:tcMar>
           </w:tcPr>
           <w:p>
@@ -4088,12 +3871,12 @@
         </w:tc>
         <w:tc>
           <w:tcPr>
-            <w:tcW w:type="dxa" w:w="2250"/>
-            <w:tcMar>
-              <w:top w:type="dxa" w:w="80"/>
-              <w:left w:type="dxa" w:w="100"/>
-              <w:bottom w:type="dxa" w:w="80"/>
-              <w:right w:type="dxa" w:w="100"/>
+            <w:tcW w:type="dxa" w:w="1300"/>
+            <w:tcMar>
+              <w:top w:type="dxa" w:w="100"/>
+              <w:left w:type="dxa" w:w="120"/>
+              <w:bottom w:type="dxa" w:w="100"/>
+              <w:right w:type="dxa" w:w="120"/>
             </w:tcMar>
           </w:tcPr>
           <w:p>
@@ -4110,12 +3893,12 @@
         </w:tc>
         <w:tc>
           <w:tcPr>
-            <w:tcW w:type="dxa" w:w="2250"/>
-            <w:tcMar>
-              <w:top w:type="dxa" w:w="80"/>
-              <w:left w:type="dxa" w:w="100"/>
-              <w:bottom w:type="dxa" w:w="80"/>
-              <w:right w:type="dxa" w:w="100"/>
+            <w:tcW w:type="dxa" w:w="1462"/>
+            <w:tcMar>
+              <w:top w:type="dxa" w:w="100"/>
+              <w:left w:type="dxa" w:w="120"/>
+              <w:bottom w:type="dxa" w:w="100"/>
+              <w:right w:type="dxa" w:w="120"/>
             </w:tcMar>
           </w:tcPr>
           <w:p>
@@ -4134,12 +3917,12 @@
       <w:tr>
         <w:tc>
           <w:tcPr>
-            <w:tcW w:type="dxa" w:w="2250"/>
-            <w:tcMar>
-              <w:top w:type="dxa" w:w="80"/>
-              <w:left w:type="dxa" w:w="100"/>
-              <w:bottom w:type="dxa" w:w="80"/>
-              <w:right w:type="dxa" w:w="100"/>
+            <w:tcW w:type="dxa" w:w="1300"/>
+            <w:tcMar>
+              <w:top w:type="dxa" w:w="100"/>
+              <w:left w:type="dxa" w:w="120"/>
+              <w:bottom w:type="dxa" w:w="100"/>
+              <w:right w:type="dxa" w:w="120"/>
             </w:tcMar>
           </w:tcPr>
           <w:p>
@@ -4156,12 +3939,12 @@
         </w:tc>
         <w:tc>
           <w:tcPr>
-            <w:tcW w:type="dxa" w:w="2250"/>
-            <w:tcMar>
-              <w:top w:type="dxa" w:w="80"/>
-              <w:left w:type="dxa" w:w="100"/>
-              <w:bottom w:type="dxa" w:w="80"/>
-              <w:right w:type="dxa" w:w="100"/>
+            <w:tcW w:type="dxa" w:w="4938"/>
+            <w:tcMar>
+              <w:top w:type="dxa" w:w="100"/>
+              <w:left w:type="dxa" w:w="120"/>
+              <w:bottom w:type="dxa" w:w="100"/>
+              <w:right w:type="dxa" w:w="120"/>
             </w:tcMar>
           </w:tcPr>
           <w:p>
@@ -4178,12 +3961,12 @@
         </w:tc>
         <w:tc>
           <w:tcPr>
-            <w:tcW w:type="dxa" w:w="2250"/>
-            <w:tcMar>
-              <w:top w:type="dxa" w:w="80"/>
-              <w:left w:type="dxa" w:w="100"/>
-              <w:bottom w:type="dxa" w:w="80"/>
-              <w:right w:type="dxa" w:w="100"/>
+            <w:tcW w:type="dxa" w:w="1300"/>
+            <w:tcMar>
+              <w:top w:type="dxa" w:w="100"/>
+              <w:left w:type="dxa" w:w="120"/>
+              <w:bottom w:type="dxa" w:w="100"/>
+              <w:right w:type="dxa" w:w="120"/>
             </w:tcMar>
           </w:tcPr>
           <w:p>
@@ -4200,12 +3983,12 @@
         </w:tc>
         <w:tc>
           <w:tcPr>
-            <w:tcW w:type="dxa" w:w="2250"/>
-            <w:tcMar>
-              <w:top w:type="dxa" w:w="80"/>
-              <w:left w:type="dxa" w:w="100"/>
-              <w:bottom w:type="dxa" w:w="80"/>
-              <w:right w:type="dxa" w:w="100"/>
+            <w:tcW w:type="dxa" w:w="1462"/>
+            <w:tcMar>
+              <w:top w:type="dxa" w:w="100"/>
+              <w:left w:type="dxa" w:w="120"/>
+              <w:bottom w:type="dxa" w:w="100"/>
+              <w:right w:type="dxa" w:w="120"/>
             </w:tcMar>
           </w:tcPr>
           <w:p>
@@ -4224,12 +4007,12 @@
       <w:tr>
         <w:tc>
           <w:tcPr>
-            <w:tcW w:type="dxa" w:w="2250"/>
-            <w:tcMar>
-              <w:top w:type="dxa" w:w="80"/>
-              <w:left w:type="dxa" w:w="100"/>
-              <w:bottom w:type="dxa" w:w="80"/>
-              <w:right w:type="dxa" w:w="100"/>
+            <w:tcW w:type="dxa" w:w="1300"/>
+            <w:tcMar>
+              <w:top w:type="dxa" w:w="100"/>
+              <w:left w:type="dxa" w:w="120"/>
+              <w:bottom w:type="dxa" w:w="100"/>
+              <w:right w:type="dxa" w:w="120"/>
             </w:tcMar>
           </w:tcPr>
           <w:p>
@@ -4246,12 +4029,12 @@
         </w:tc>
         <w:tc>
           <w:tcPr>
-            <w:tcW w:type="dxa" w:w="2250"/>
-            <w:tcMar>
-              <w:top w:type="dxa" w:w="80"/>
-              <w:left w:type="dxa" w:w="100"/>
-              <w:bottom w:type="dxa" w:w="80"/>
-              <w:right w:type="dxa" w:w="100"/>
+            <w:tcW w:type="dxa" w:w="4938"/>
+            <w:tcMar>
+              <w:top w:type="dxa" w:w="100"/>
+              <w:left w:type="dxa" w:w="120"/>
+              <w:bottom w:type="dxa" w:w="100"/>
+              <w:right w:type="dxa" w:w="120"/>
             </w:tcMar>
           </w:tcPr>
           <w:p>
@@ -4268,12 +4051,12 @@
         </w:tc>
         <w:tc>
           <w:tcPr>
-            <w:tcW w:type="dxa" w:w="2250"/>
-            <w:tcMar>
-              <w:top w:type="dxa" w:w="80"/>
-              <w:left w:type="dxa" w:w="100"/>
-              <w:bottom w:type="dxa" w:w="80"/>
-              <w:right w:type="dxa" w:w="100"/>
+            <w:tcW w:type="dxa" w:w="1300"/>
+            <w:tcMar>
+              <w:top w:type="dxa" w:w="100"/>
+              <w:left w:type="dxa" w:w="120"/>
+              <w:bottom w:type="dxa" w:w="100"/>
+              <w:right w:type="dxa" w:w="120"/>
             </w:tcMar>
           </w:tcPr>
           <w:p>
@@ -4290,12 +4073,12 @@
         </w:tc>
         <w:tc>
           <w:tcPr>
-            <w:tcW w:type="dxa" w:w="2250"/>
-            <w:tcMar>
-              <w:top w:type="dxa" w:w="80"/>
-              <w:left w:type="dxa" w:w="100"/>
-              <w:bottom w:type="dxa" w:w="80"/>
-              <w:right w:type="dxa" w:w="100"/>
+            <w:tcW w:type="dxa" w:w="1462"/>
+            <w:tcMar>
+              <w:top w:type="dxa" w:w="100"/>
+              <w:left w:type="dxa" w:w="120"/>
+              <w:bottom w:type="dxa" w:w="100"/>
+              <w:right w:type="dxa" w:w="120"/>
             </w:tcMar>
           </w:tcPr>
           <w:p>
@@ -4314,12 +4097,12 @@
       <w:tr>
         <w:tc>
           <w:tcPr>
-            <w:tcW w:type="dxa" w:w="2250"/>
-            <w:tcMar>
-              <w:top w:type="dxa" w:w="80"/>
-              <w:left w:type="dxa" w:w="100"/>
-              <w:bottom w:type="dxa" w:w="80"/>
-              <w:right w:type="dxa" w:w="100"/>
+            <w:tcW w:type="dxa" w:w="1300"/>
+            <w:tcMar>
+              <w:top w:type="dxa" w:w="100"/>
+              <w:left w:type="dxa" w:w="120"/>
+              <w:bottom w:type="dxa" w:w="100"/>
+              <w:right w:type="dxa" w:w="120"/>
             </w:tcMar>
           </w:tcPr>
           <w:p>
@@ -4336,12 +4119,12 @@
         </w:tc>
         <w:tc>
           <w:tcPr>
-            <w:tcW w:type="dxa" w:w="2250"/>
-            <w:tcMar>
-              <w:top w:type="dxa" w:w="80"/>
-              <w:left w:type="dxa" w:w="100"/>
-              <w:bottom w:type="dxa" w:w="80"/>
-              <w:right w:type="dxa" w:w="100"/>
+            <w:tcW w:type="dxa" w:w="4938"/>
+            <w:tcMar>
+              <w:top w:type="dxa" w:w="100"/>
+              <w:left w:type="dxa" w:w="120"/>
+              <w:bottom w:type="dxa" w:w="100"/>
+              <w:right w:type="dxa" w:w="120"/>
             </w:tcMar>
           </w:tcPr>
           <w:p>
@@ -4358,12 +4141,12 @@
         </w:tc>
         <w:tc>
           <w:tcPr>
-            <w:tcW w:type="dxa" w:w="2250"/>
-            <w:tcMar>
-              <w:top w:type="dxa" w:w="80"/>
-              <w:left w:type="dxa" w:w="100"/>
-              <w:bottom w:type="dxa" w:w="80"/>
-              <w:right w:type="dxa" w:w="100"/>
+            <w:tcW w:type="dxa" w:w="1300"/>
+            <w:tcMar>
+              <w:top w:type="dxa" w:w="100"/>
+              <w:left w:type="dxa" w:w="120"/>
+              <w:bottom w:type="dxa" w:w="100"/>
+              <w:right w:type="dxa" w:w="120"/>
             </w:tcMar>
           </w:tcPr>
           <w:p>
@@ -4380,12 +4163,12 @@
         </w:tc>
         <w:tc>
           <w:tcPr>
-            <w:tcW w:type="dxa" w:w="2250"/>
-            <w:tcMar>
-              <w:top w:type="dxa" w:w="80"/>
-              <w:left w:type="dxa" w:w="100"/>
-              <w:bottom w:type="dxa" w:w="80"/>
-              <w:right w:type="dxa" w:w="100"/>
+            <w:tcW w:type="dxa" w:w="1462"/>
+            <w:tcMar>
+              <w:top w:type="dxa" w:w="100"/>
+              <w:left w:type="dxa" w:w="120"/>
+              <w:bottom w:type="dxa" w:w="100"/>
+              <w:right w:type="dxa" w:w="120"/>
             </w:tcMar>
           </w:tcPr>
           <w:p>
@@ -4404,12 +4187,12 @@
       <w:tr>
         <w:tc>
           <w:tcPr>
-            <w:tcW w:type="dxa" w:w="2250"/>
-            <w:tcMar>
-              <w:top w:type="dxa" w:w="80"/>
-              <w:left w:type="dxa" w:w="100"/>
-              <w:bottom w:type="dxa" w:w="80"/>
-              <w:right w:type="dxa" w:w="100"/>
+            <w:tcW w:type="dxa" w:w="1300"/>
+            <w:tcMar>
+              <w:top w:type="dxa" w:w="100"/>
+              <w:left w:type="dxa" w:w="120"/>
+              <w:bottom w:type="dxa" w:w="100"/>
+              <w:right w:type="dxa" w:w="120"/>
             </w:tcMar>
           </w:tcPr>
           <w:p>
@@ -4426,12 +4209,12 @@
         </w:tc>
         <w:tc>
           <w:tcPr>
-            <w:tcW w:type="dxa" w:w="2250"/>
-            <w:tcMar>
-              <w:top w:type="dxa" w:w="80"/>
-              <w:left w:type="dxa" w:w="100"/>
-              <w:bottom w:type="dxa" w:w="80"/>
-              <w:right w:type="dxa" w:w="100"/>
+            <w:tcW w:type="dxa" w:w="4938"/>
+            <w:tcMar>
+              <w:top w:type="dxa" w:w="100"/>
+              <w:left w:type="dxa" w:w="120"/>
+              <w:bottom w:type="dxa" w:w="100"/>
+              <w:right w:type="dxa" w:w="120"/>
             </w:tcMar>
           </w:tcPr>
           <w:p>
@@ -4448,12 +4231,12 @@
         </w:tc>
         <w:tc>
           <w:tcPr>
-            <w:tcW w:type="dxa" w:w="2250"/>
-            <w:tcMar>
-              <w:top w:type="dxa" w:w="80"/>
-              <w:left w:type="dxa" w:w="100"/>
-              <w:bottom w:type="dxa" w:w="80"/>
-              <w:right w:type="dxa" w:w="100"/>
+            <w:tcW w:type="dxa" w:w="1300"/>
+            <w:tcMar>
+              <w:top w:type="dxa" w:w="100"/>
+              <w:left w:type="dxa" w:w="120"/>
+              <w:bottom w:type="dxa" w:w="100"/>
+              <w:right w:type="dxa" w:w="120"/>
             </w:tcMar>
           </w:tcPr>
           <w:p>
@@ -4470,12 +4253,12 @@
         </w:tc>
         <w:tc>
           <w:tcPr>
-            <w:tcW w:type="dxa" w:w="2250"/>
-            <w:tcMar>
-              <w:top w:type="dxa" w:w="80"/>
-              <w:left w:type="dxa" w:w="100"/>
-              <w:bottom w:type="dxa" w:w="80"/>
-              <w:right w:type="dxa" w:w="100"/>
+            <w:tcW w:type="dxa" w:w="1462"/>
+            <w:tcMar>
+              <w:top w:type="dxa" w:w="100"/>
+              <w:left w:type="dxa" w:w="120"/>
+              <w:bottom w:type="dxa" w:w="100"/>
+              <w:right w:type="dxa" w:w="120"/>
             </w:tcMar>
           </w:tcPr>
           <w:p>
@@ -4494,12 +4277,12 @@
       <w:tr>
         <w:tc>
           <w:tcPr>
-            <w:tcW w:type="dxa" w:w="2250"/>
-            <w:tcMar>
-              <w:top w:type="dxa" w:w="80"/>
-              <w:left w:type="dxa" w:w="100"/>
-              <w:bottom w:type="dxa" w:w="80"/>
-              <w:right w:type="dxa" w:w="100"/>
+            <w:tcW w:type="dxa" w:w="1300"/>
+            <w:tcMar>
+              <w:top w:type="dxa" w:w="100"/>
+              <w:left w:type="dxa" w:w="120"/>
+              <w:bottom w:type="dxa" w:w="100"/>
+              <w:right w:type="dxa" w:w="120"/>
             </w:tcMar>
           </w:tcPr>
           <w:p>
@@ -4516,12 +4299,12 @@
         </w:tc>
         <w:tc>
           <w:tcPr>
-            <w:tcW w:type="dxa" w:w="2250"/>
-            <w:tcMar>
-              <w:top w:type="dxa" w:w="80"/>
-              <w:left w:type="dxa" w:w="100"/>
-              <w:bottom w:type="dxa" w:w="80"/>
-              <w:right w:type="dxa" w:w="100"/>
+            <w:tcW w:type="dxa" w:w="4938"/>
+            <w:tcMar>
+              <w:top w:type="dxa" w:w="100"/>
+              <w:left w:type="dxa" w:w="120"/>
+              <w:bottom w:type="dxa" w:w="100"/>
+              <w:right w:type="dxa" w:w="120"/>
             </w:tcMar>
           </w:tcPr>
           <w:p>
@@ -4538,12 +4321,12 @@
         </w:tc>
         <w:tc>
           <w:tcPr>
-            <w:tcW w:type="dxa" w:w="2250"/>
-            <w:tcMar>
-              <w:top w:type="dxa" w:w="80"/>
-              <w:left w:type="dxa" w:w="100"/>
-              <w:bottom w:type="dxa" w:w="80"/>
-              <w:right w:type="dxa" w:w="100"/>
+            <w:tcW w:type="dxa" w:w="1300"/>
+            <w:tcMar>
+              <w:top w:type="dxa" w:w="100"/>
+              <w:left w:type="dxa" w:w="120"/>
+              <w:bottom w:type="dxa" w:w="100"/>
+              <w:right w:type="dxa" w:w="120"/>
             </w:tcMar>
           </w:tcPr>
           <w:p>
@@ -4560,12 +4343,12 @@
         </w:tc>
         <w:tc>
           <w:tcPr>
-            <w:tcW w:type="dxa" w:w="2250"/>
-            <w:tcMar>
-              <w:top w:type="dxa" w:w="80"/>
-              <w:left w:type="dxa" w:w="100"/>
-              <w:bottom w:type="dxa" w:w="80"/>
-              <w:right w:type="dxa" w:w="100"/>
+            <w:tcW w:type="dxa" w:w="1462"/>
+            <w:tcMar>
+              <w:top w:type="dxa" w:w="100"/>
+              <w:left w:type="dxa" w:w="120"/>
+              <w:bottom w:type="dxa" w:w="100"/>
+              <w:right w:type="dxa" w:w="120"/>
             </w:tcMar>
           </w:tcPr>
           <w:p>
@@ -4584,12 +4367,12 @@
       <w:tr>
         <w:tc>
           <w:tcPr>
-            <w:tcW w:type="dxa" w:w="2250"/>
-            <w:tcMar>
-              <w:top w:type="dxa" w:w="80"/>
-              <w:left w:type="dxa" w:w="100"/>
-              <w:bottom w:type="dxa" w:w="80"/>
-              <w:right w:type="dxa" w:w="100"/>
+            <w:tcW w:type="dxa" w:w="1300"/>
+            <w:tcMar>
+              <w:top w:type="dxa" w:w="100"/>
+              <w:left w:type="dxa" w:w="120"/>
+              <w:bottom w:type="dxa" w:w="100"/>
+              <w:right w:type="dxa" w:w="120"/>
             </w:tcMar>
           </w:tcPr>
           <w:p>
@@ -4606,12 +4389,12 @@
         </w:tc>
         <w:tc>
           <w:tcPr>
-            <w:tcW w:type="dxa" w:w="2250"/>
-            <w:tcMar>
-              <w:top w:type="dxa" w:w="80"/>
-              <w:left w:type="dxa" w:w="100"/>
-              <w:bottom w:type="dxa" w:w="80"/>
-              <w:right w:type="dxa" w:w="100"/>
+            <w:tcW w:type="dxa" w:w="4938"/>
+            <w:tcMar>
+              <w:top w:type="dxa" w:w="100"/>
+              <w:left w:type="dxa" w:w="120"/>
+              <w:bottom w:type="dxa" w:w="100"/>
+              <w:right w:type="dxa" w:w="120"/>
             </w:tcMar>
           </w:tcPr>
           <w:p>
@@ -4628,12 +4411,12 @@
         </w:tc>
         <w:tc>
           <w:tcPr>
-            <w:tcW w:type="dxa" w:w="2250"/>
-            <w:tcMar>
-              <w:top w:type="dxa" w:w="80"/>
-              <w:left w:type="dxa" w:w="100"/>
-              <w:bottom w:type="dxa" w:w="80"/>
-              <w:right w:type="dxa" w:w="100"/>
+            <w:tcW w:type="dxa" w:w="1300"/>
+            <w:tcMar>
+              <w:top w:type="dxa" w:w="100"/>
+              <w:left w:type="dxa" w:w="120"/>
+              <w:bottom w:type="dxa" w:w="100"/>
+              <w:right w:type="dxa" w:w="120"/>
             </w:tcMar>
           </w:tcPr>
           <w:p>
@@ -4650,12 +4433,12 @@
         </w:tc>
         <w:tc>
           <w:tcPr>
-            <w:tcW w:type="dxa" w:w="2250"/>
-            <w:tcMar>
-              <w:top w:type="dxa" w:w="80"/>
-              <w:left w:type="dxa" w:w="100"/>
-              <w:bottom w:type="dxa" w:w="80"/>
-              <w:right w:type="dxa" w:w="100"/>
+            <w:tcW w:type="dxa" w:w="1462"/>
+            <w:tcMar>
+              <w:top w:type="dxa" w:w="100"/>
+              <w:left w:type="dxa" w:w="120"/>
+              <w:bottom w:type="dxa" w:w="100"/>
+              <w:right w:type="dxa" w:w="120"/>
             </w:tcMar>
           </w:tcPr>
           <w:p>
@@ -4674,12 +4457,12 @@
       <w:tr>
         <w:tc>
           <w:tcPr>
-            <w:tcW w:type="dxa" w:w="2250"/>
-            <w:tcMar>
-              <w:top w:type="dxa" w:w="80"/>
-              <w:left w:type="dxa" w:w="100"/>
-              <w:bottom w:type="dxa" w:w="80"/>
-              <w:right w:type="dxa" w:w="100"/>
+            <w:tcW w:type="dxa" w:w="1300"/>
+            <w:tcMar>
+              <w:top w:type="dxa" w:w="100"/>
+              <w:left w:type="dxa" w:w="120"/>
+              <w:bottom w:type="dxa" w:w="100"/>
+              <w:right w:type="dxa" w:w="120"/>
             </w:tcMar>
           </w:tcPr>
           <w:p>
@@ -4696,12 +4479,12 @@
         </w:tc>
         <w:tc>
           <w:tcPr>
-            <w:tcW w:type="dxa" w:w="2250"/>
-            <w:tcMar>
-              <w:top w:type="dxa" w:w="80"/>
-              <w:left w:type="dxa" w:w="100"/>
-              <w:bottom w:type="dxa" w:w="80"/>
-              <w:right w:type="dxa" w:w="100"/>
+            <w:tcW w:type="dxa" w:w="4938"/>
+            <w:tcMar>
+              <w:top w:type="dxa" w:w="100"/>
+              <w:left w:type="dxa" w:w="120"/>
+              <w:bottom w:type="dxa" w:w="100"/>
+              <w:right w:type="dxa" w:w="120"/>
             </w:tcMar>
           </w:tcPr>
           <w:p>
@@ -4718,12 +4501,12 @@
         </w:tc>
         <w:tc>
           <w:tcPr>
-            <w:tcW w:type="dxa" w:w="2250"/>
-            <w:tcMar>
-              <w:top w:type="dxa" w:w="80"/>
-              <w:left w:type="dxa" w:w="100"/>
-              <w:bottom w:type="dxa" w:w="80"/>
-              <w:right w:type="dxa" w:w="100"/>
+            <w:tcW w:type="dxa" w:w="1300"/>
+            <w:tcMar>
+              <w:top w:type="dxa" w:w="100"/>
+              <w:left w:type="dxa" w:w="120"/>
+              <w:bottom w:type="dxa" w:w="100"/>
+              <w:right w:type="dxa" w:w="120"/>
             </w:tcMar>
           </w:tcPr>
           <w:p>
@@ -4740,12 +4523,12 @@
         </w:tc>
         <w:tc>
           <w:tcPr>
-            <w:tcW w:type="dxa" w:w="2250"/>
-            <w:tcMar>
-              <w:top w:type="dxa" w:w="80"/>
-              <w:left w:type="dxa" w:w="100"/>
-              <w:bottom w:type="dxa" w:w="80"/>
-              <w:right w:type="dxa" w:w="100"/>
+            <w:tcW w:type="dxa" w:w="1462"/>
+            <w:tcMar>
+              <w:top w:type="dxa" w:w="100"/>
+              <w:left w:type="dxa" w:w="120"/>
+              <w:bottom w:type="dxa" w:w="100"/>
+              <w:right w:type="dxa" w:w="120"/>
             </w:tcMar>
           </w:tcPr>
           <w:p>
@@ -4764,7 +4547,7 @@
     </w:tbl>
     <w:p>
       <w:pPr>
-        <w:spacing w:after="200"/>
+        <w:spacing w:after="160"/>
       </w:pPr>
     </w:p>
     <w:p>
@@ -4784,19 +4567,8 @@
     </w:p>
     <w:p>
       <w:pPr>
-        <w:pBdr>
-          <w:bottom w:val="single" w:color="C9A24B" w:sz="6"/>
-        </w:pBdr>
-        <w:spacing w:after="200" w:before="200"/>
-      </w:pPr>
-    </w:p>
-    <w:p>
-      <w:pPr>
         <w:pStyle w:val="Heading1"/>
-        <w:pBdr>
-          <w:bottom w:val="single" w:color="1A1A2E" w:sz="4"/>
-        </w:pBdr>
-        <w:spacing w:after="160" w:before="360"/>
+        <w:spacing w:after="160" w:before="400"/>
       </w:pPr>
       <w:r>
         <w:t xml:space="preserve">WEEKLY CONTENT RHYTHM</w:t>
@@ -4815,20 +4587,20 @@
         </w:tblBorders>
       </w:tblPr>
       <w:tblGrid>
-        <w:gridCol w:w="3000"/>
-        <w:gridCol w:w="3000"/>
-        <w:gridCol w:w="3000"/>
+        <w:gridCol w:w="1543"/>
+        <w:gridCol w:w="3986"/>
+        <w:gridCol w:w="3471"/>
       </w:tblGrid>
       <w:tr>
         <w:tc>
           <w:tcPr>
-            <w:tcW w:type="dxa" w:w="3000"/>
+            <w:tcW w:type="dxa" w:w="1543"/>
             <w:shd w:fill="1A1A2E" w:color="auto" w:val="clear"/>
             <w:tcMar>
-              <w:top w:type="dxa" w:w="80"/>
-              <w:left w:type="dxa" w:w="100"/>
-              <w:bottom w:type="dxa" w:w="80"/>
-              <w:right w:type="dxa" w:w="100"/>
+              <w:top w:type="dxa" w:w="100"/>
+              <w:left w:type="dxa" w:w="120"/>
+              <w:bottom w:type="dxa" w:w="100"/>
+              <w:right w:type="dxa" w:w="120"/>
             </w:tcMar>
           </w:tcPr>
           <w:p>
@@ -4846,13 +4618,13 @@
         </w:tc>
         <w:tc>
           <w:tcPr>
-            <w:tcW w:type="dxa" w:w="3000"/>
+            <w:tcW w:type="dxa" w:w="3986"/>
             <w:shd w:fill="1A1A2E" w:color="auto" w:val="clear"/>
             <w:tcMar>
-              <w:top w:type="dxa" w:w="80"/>
-              <w:left w:type="dxa" w:w="100"/>
-              <w:bottom w:type="dxa" w:w="80"/>
-              <w:right w:type="dxa" w:w="100"/>
+              <w:top w:type="dxa" w:w="100"/>
+              <w:left w:type="dxa" w:w="120"/>
+              <w:bottom w:type="dxa" w:w="100"/>
+              <w:right w:type="dxa" w:w="120"/>
             </w:tcMar>
           </w:tcPr>
           <w:p>
@@ -4870,13 +4642,13 @@
         </w:tc>
         <w:tc>
           <w:tcPr>
-            <w:tcW w:type="dxa" w:w="3000"/>
+            <w:tcW w:type="dxa" w:w="3471"/>
             <w:shd w:fill="1A1A2E" w:color="auto" w:val="clear"/>
             <w:tcMar>
-              <w:top w:type="dxa" w:w="80"/>
-              <w:left w:type="dxa" w:w="100"/>
-              <w:bottom w:type="dxa" w:w="80"/>
-              <w:right w:type="dxa" w:w="100"/>
+              <w:top w:type="dxa" w:w="100"/>
+              <w:left w:type="dxa" w:w="120"/>
+              <w:bottom w:type="dxa" w:w="100"/>
+              <w:right w:type="dxa" w:w="120"/>
             </w:tcMar>
           </w:tcPr>
           <w:p>
@@ -4896,12 +4668,12 @@
       <w:tr>
         <w:tc>
           <w:tcPr>
-            <w:tcW w:type="dxa" w:w="3000"/>
-            <w:tcMar>
-              <w:top w:type="dxa" w:w="80"/>
-              <w:left w:type="dxa" w:w="100"/>
-              <w:bottom w:type="dxa" w:w="80"/>
-              <w:right w:type="dxa" w:w="100"/>
+            <w:tcW w:type="dxa" w:w="1543"/>
+            <w:tcMar>
+              <w:top w:type="dxa" w:w="100"/>
+              <w:left w:type="dxa" w:w="120"/>
+              <w:bottom w:type="dxa" w:w="100"/>
+              <w:right w:type="dxa" w:w="120"/>
             </w:tcMar>
           </w:tcPr>
           <w:p>
@@ -4918,12 +4690,12 @@
         </w:tc>
         <w:tc>
           <w:tcPr>
-            <w:tcW w:type="dxa" w:w="3000"/>
-            <w:tcMar>
-              <w:top w:type="dxa" w:w="80"/>
-              <w:left w:type="dxa" w:w="100"/>
-              <w:bottom w:type="dxa" w:w="80"/>
-              <w:right w:type="dxa" w:w="100"/>
+            <w:tcW w:type="dxa" w:w="3986"/>
+            <w:tcMar>
+              <w:top w:type="dxa" w:w="100"/>
+              <w:left w:type="dxa" w:w="120"/>
+              <w:bottom w:type="dxa" w:w="100"/>
+              <w:right w:type="dxa" w:w="120"/>
             </w:tcMar>
           </w:tcPr>
           <w:p>
@@ -4940,12 +4712,12 @@
         </w:tc>
         <w:tc>
           <w:tcPr>
-            <w:tcW w:type="dxa" w:w="3000"/>
-            <w:tcMar>
-              <w:top w:type="dxa" w:w="80"/>
-              <w:left w:type="dxa" w:w="100"/>
-              <w:bottom w:type="dxa" w:w="80"/>
-              <w:right w:type="dxa" w:w="100"/>
+            <w:tcW w:type="dxa" w:w="3471"/>
+            <w:tcMar>
+              <w:top w:type="dxa" w:w="100"/>
+              <w:left w:type="dxa" w:w="120"/>
+              <w:bottom w:type="dxa" w:w="100"/>
+              <w:right w:type="dxa" w:w="120"/>
             </w:tcMar>
           </w:tcPr>
           <w:p>
@@ -4964,12 +4736,12 @@
       <w:tr>
         <w:tc>
           <w:tcPr>
-            <w:tcW w:type="dxa" w:w="3000"/>
-            <w:tcMar>
-              <w:top w:type="dxa" w:w="80"/>
-              <w:left w:type="dxa" w:w="100"/>
-              <w:bottom w:type="dxa" w:w="80"/>
-              <w:right w:type="dxa" w:w="100"/>
+            <w:tcW w:type="dxa" w:w="1543"/>
+            <w:tcMar>
+              <w:top w:type="dxa" w:w="100"/>
+              <w:left w:type="dxa" w:w="120"/>
+              <w:bottom w:type="dxa" w:w="100"/>
+              <w:right w:type="dxa" w:w="120"/>
             </w:tcMar>
           </w:tcPr>
           <w:p>
@@ -4986,12 +4758,12 @@
         </w:tc>
         <w:tc>
           <w:tcPr>
-            <w:tcW w:type="dxa" w:w="3000"/>
-            <w:tcMar>
-              <w:top w:type="dxa" w:w="80"/>
-              <w:left w:type="dxa" w:w="100"/>
-              <w:bottom w:type="dxa" w:w="80"/>
-              <w:right w:type="dxa" w:w="100"/>
+            <w:tcW w:type="dxa" w:w="3986"/>
+            <w:tcMar>
+              <w:top w:type="dxa" w:w="100"/>
+              <w:left w:type="dxa" w:w="120"/>
+              <w:bottom w:type="dxa" w:w="100"/>
+              <w:right w:type="dxa" w:w="120"/>
             </w:tcMar>
           </w:tcPr>
           <w:p>
@@ -5008,12 +4780,12 @@
         </w:tc>
         <w:tc>
           <w:tcPr>
-            <w:tcW w:type="dxa" w:w="3000"/>
-            <w:tcMar>
-              <w:top w:type="dxa" w:w="80"/>
-              <w:left w:type="dxa" w:w="100"/>
-              <w:bottom w:type="dxa" w:w="80"/>
-              <w:right w:type="dxa" w:w="100"/>
+            <w:tcW w:type="dxa" w:w="3471"/>
+            <w:tcMar>
+              <w:top w:type="dxa" w:w="100"/>
+              <w:left w:type="dxa" w:w="120"/>
+              <w:bottom w:type="dxa" w:w="100"/>
+              <w:right w:type="dxa" w:w="120"/>
             </w:tcMar>
           </w:tcPr>
           <w:p>
@@ -5032,12 +4804,12 @@
       <w:tr>
         <w:tc>
           <w:tcPr>
-            <w:tcW w:type="dxa" w:w="3000"/>
-            <w:tcMar>
-              <w:top w:type="dxa" w:w="80"/>
-              <w:left w:type="dxa" w:w="100"/>
-              <w:bottom w:type="dxa" w:w="80"/>
-              <w:right w:type="dxa" w:w="100"/>
+            <w:tcW w:type="dxa" w:w="1543"/>
+            <w:tcMar>
+              <w:top w:type="dxa" w:w="100"/>
+              <w:left w:type="dxa" w:w="120"/>
+              <w:bottom w:type="dxa" w:w="100"/>
+              <w:right w:type="dxa" w:w="120"/>
             </w:tcMar>
           </w:tcPr>
           <w:p>
@@ -5054,12 +4826,12 @@
         </w:tc>
         <w:tc>
           <w:tcPr>
-            <w:tcW w:type="dxa" w:w="3000"/>
-            <w:tcMar>
-              <w:top w:type="dxa" w:w="80"/>
-              <w:left w:type="dxa" w:w="100"/>
-              <w:bottom w:type="dxa" w:w="80"/>
-              <w:right w:type="dxa" w:w="100"/>
+            <w:tcW w:type="dxa" w:w="3986"/>
+            <w:tcMar>
+              <w:top w:type="dxa" w:w="100"/>
+              <w:left w:type="dxa" w:w="120"/>
+              <w:bottom w:type="dxa" w:w="100"/>
+              <w:right w:type="dxa" w:w="120"/>
             </w:tcMar>
           </w:tcPr>
           <w:p>
@@ -5076,12 +4848,12 @@
         </w:tc>
         <w:tc>
           <w:tcPr>
-            <w:tcW w:type="dxa" w:w="3000"/>
-            <w:tcMar>
-              <w:top w:type="dxa" w:w="80"/>
-              <w:left w:type="dxa" w:w="100"/>
-              <w:bottom w:type="dxa" w:w="80"/>
-              <w:right w:type="dxa" w:w="100"/>
+            <w:tcW w:type="dxa" w:w="3471"/>
+            <w:tcMar>
+              <w:top w:type="dxa" w:w="100"/>
+              <w:left w:type="dxa" w:w="120"/>
+              <w:bottom w:type="dxa" w:w="100"/>
+              <w:right w:type="dxa" w:w="120"/>
             </w:tcMar>
           </w:tcPr>
           <w:p>
@@ -5100,12 +4872,12 @@
       <w:tr>
         <w:tc>
           <w:tcPr>
-            <w:tcW w:type="dxa" w:w="3000"/>
-            <w:tcMar>
-              <w:top w:type="dxa" w:w="80"/>
-              <w:left w:type="dxa" w:w="100"/>
-              <w:bottom w:type="dxa" w:w="80"/>
-              <w:right w:type="dxa" w:w="100"/>
+            <w:tcW w:type="dxa" w:w="1543"/>
+            <w:tcMar>
+              <w:top w:type="dxa" w:w="100"/>
+              <w:left w:type="dxa" w:w="120"/>
+              <w:bottom w:type="dxa" w:w="100"/>
+              <w:right w:type="dxa" w:w="120"/>
             </w:tcMar>
           </w:tcPr>
           <w:p>
@@ -5122,12 +4894,12 @@
         </w:tc>
         <w:tc>
           <w:tcPr>
-            <w:tcW w:type="dxa" w:w="3000"/>
-            <w:tcMar>
-              <w:top w:type="dxa" w:w="80"/>
-              <w:left w:type="dxa" w:w="100"/>
-              <w:bottom w:type="dxa" w:w="80"/>
-              <w:right w:type="dxa" w:w="100"/>
+            <w:tcW w:type="dxa" w:w="3986"/>
+            <w:tcMar>
+              <w:top w:type="dxa" w:w="100"/>
+              <w:left w:type="dxa" w:w="120"/>
+              <w:bottom w:type="dxa" w:w="100"/>
+              <w:right w:type="dxa" w:w="120"/>
             </w:tcMar>
           </w:tcPr>
           <w:p>
@@ -5144,12 +4916,12 @@
         </w:tc>
         <w:tc>
           <w:tcPr>
-            <w:tcW w:type="dxa" w:w="3000"/>
-            <w:tcMar>
-              <w:top w:type="dxa" w:w="80"/>
-              <w:left w:type="dxa" w:w="100"/>
-              <w:bottom w:type="dxa" w:w="80"/>
-              <w:right w:type="dxa" w:w="100"/>
+            <w:tcW w:type="dxa" w:w="3471"/>
+            <w:tcMar>
+              <w:top w:type="dxa" w:w="100"/>
+              <w:left w:type="dxa" w:w="120"/>
+              <w:bottom w:type="dxa" w:w="100"/>
+              <w:right w:type="dxa" w:w="120"/>
             </w:tcMar>
           </w:tcPr>
           <w:p>
@@ -5168,12 +4940,12 @@
       <w:tr>
         <w:tc>
           <w:tcPr>
-            <w:tcW w:type="dxa" w:w="3000"/>
-            <w:tcMar>
-              <w:top w:type="dxa" w:w="80"/>
-              <w:left w:type="dxa" w:w="100"/>
-              <w:bottom w:type="dxa" w:w="80"/>
-              <w:right w:type="dxa" w:w="100"/>
+            <w:tcW w:type="dxa" w:w="1543"/>
+            <w:tcMar>
+              <w:top w:type="dxa" w:w="100"/>
+              <w:left w:type="dxa" w:w="120"/>
+              <w:bottom w:type="dxa" w:w="100"/>
+              <w:right w:type="dxa" w:w="120"/>
             </w:tcMar>
           </w:tcPr>
           <w:p>
@@ -5190,12 +4962,12 @@
         </w:tc>
         <w:tc>
           <w:tcPr>
-            <w:tcW w:type="dxa" w:w="3000"/>
-            <w:tcMar>
-              <w:top w:type="dxa" w:w="80"/>
-              <w:left w:type="dxa" w:w="100"/>
-              <w:bottom w:type="dxa" w:w="80"/>
-              <w:right w:type="dxa" w:w="100"/>
+            <w:tcW w:type="dxa" w:w="3986"/>
+            <w:tcMar>
+              <w:top w:type="dxa" w:w="100"/>
+              <w:left w:type="dxa" w:w="120"/>
+              <w:bottom w:type="dxa" w:w="100"/>
+              <w:right w:type="dxa" w:w="120"/>
             </w:tcMar>
           </w:tcPr>
           <w:p>
@@ -5212,12 +4984,12 @@
         </w:tc>
         <w:tc>
           <w:tcPr>
-            <w:tcW w:type="dxa" w:w="3000"/>
-            <w:tcMar>
-              <w:top w:type="dxa" w:w="80"/>
-              <w:left w:type="dxa" w:w="100"/>
-              <w:bottom w:type="dxa" w:w="80"/>
-              <w:right w:type="dxa" w:w="100"/>
+            <w:tcW w:type="dxa" w:w="3471"/>
+            <w:tcMar>
+              <w:top w:type="dxa" w:w="100"/>
+              <w:left w:type="dxa" w:w="120"/>
+              <w:bottom w:type="dxa" w:w="100"/>
+              <w:right w:type="dxa" w:w="120"/>
             </w:tcMar>
           </w:tcPr>
           <w:p>
@@ -5236,12 +5008,12 @@
       <w:tr>
         <w:tc>
           <w:tcPr>
-            <w:tcW w:type="dxa" w:w="3000"/>
-            <w:tcMar>
-              <w:top w:type="dxa" w:w="80"/>
-              <w:left w:type="dxa" w:w="100"/>
-              <w:bottom w:type="dxa" w:w="80"/>
-              <w:right w:type="dxa" w:w="100"/>
+            <w:tcW w:type="dxa" w:w="1543"/>
+            <w:tcMar>
+              <w:top w:type="dxa" w:w="100"/>
+              <w:left w:type="dxa" w:w="120"/>
+              <w:bottom w:type="dxa" w:w="100"/>
+              <w:right w:type="dxa" w:w="120"/>
             </w:tcMar>
           </w:tcPr>
           <w:p>
@@ -5258,12 +5030,12 @@
         </w:tc>
         <w:tc>
           <w:tcPr>
-            <w:tcW w:type="dxa" w:w="3000"/>
-            <w:tcMar>
-              <w:top w:type="dxa" w:w="80"/>
-              <w:left w:type="dxa" w:w="100"/>
-              <w:bottom w:type="dxa" w:w="80"/>
-              <w:right w:type="dxa" w:w="100"/>
+            <w:tcW w:type="dxa" w:w="3986"/>
+            <w:tcMar>
+              <w:top w:type="dxa" w:w="100"/>
+              <w:left w:type="dxa" w:w="120"/>
+              <w:bottom w:type="dxa" w:w="100"/>
+              <w:right w:type="dxa" w:w="120"/>
             </w:tcMar>
           </w:tcPr>
           <w:p>
@@ -5280,12 +5052,12 @@
         </w:tc>
         <w:tc>
           <w:tcPr>
-            <w:tcW w:type="dxa" w:w="3000"/>
-            <w:tcMar>
-              <w:top w:type="dxa" w:w="80"/>
-              <w:left w:type="dxa" w:w="100"/>
-              <w:bottom w:type="dxa" w:w="80"/>
-              <w:right w:type="dxa" w:w="100"/>
+            <w:tcW w:type="dxa" w:w="3471"/>
+            <w:tcMar>
+              <w:top w:type="dxa" w:w="100"/>
+              <w:left w:type="dxa" w:w="120"/>
+              <w:bottom w:type="dxa" w:w="100"/>
+              <w:right w:type="dxa" w:w="120"/>
             </w:tcMar>
           </w:tcPr>
           <w:p>
@@ -5304,12 +5076,12 @@
       <w:tr>
         <w:tc>
           <w:tcPr>
-            <w:tcW w:type="dxa" w:w="3000"/>
-            <w:tcMar>
-              <w:top w:type="dxa" w:w="80"/>
-              <w:left w:type="dxa" w:w="100"/>
-              <w:bottom w:type="dxa" w:w="80"/>
-              <w:right w:type="dxa" w:w="100"/>
+            <w:tcW w:type="dxa" w:w="1543"/>
+            <w:tcMar>
+              <w:top w:type="dxa" w:w="100"/>
+              <w:left w:type="dxa" w:w="120"/>
+              <w:bottom w:type="dxa" w:w="100"/>
+              <w:right w:type="dxa" w:w="120"/>
             </w:tcMar>
           </w:tcPr>
           <w:p>
@@ -5326,12 +5098,12 @@
         </w:tc>
         <w:tc>
           <w:tcPr>
-            <w:tcW w:type="dxa" w:w="3000"/>
-            <w:tcMar>
-              <w:top w:type="dxa" w:w="80"/>
-              <w:left w:type="dxa" w:w="100"/>
-              <w:bottom w:type="dxa" w:w="80"/>
-              <w:right w:type="dxa" w:w="100"/>
+            <w:tcW w:type="dxa" w:w="3986"/>
+            <w:tcMar>
+              <w:top w:type="dxa" w:w="100"/>
+              <w:left w:type="dxa" w:w="120"/>
+              <w:bottom w:type="dxa" w:w="100"/>
+              <w:right w:type="dxa" w:w="120"/>
             </w:tcMar>
           </w:tcPr>
           <w:p>
@@ -5348,12 +5120,12 @@
         </w:tc>
         <w:tc>
           <w:tcPr>
-            <w:tcW w:type="dxa" w:w="3000"/>
-            <w:tcMar>
-              <w:top w:type="dxa" w:w="80"/>
-              <w:left w:type="dxa" w:w="100"/>
-              <w:bottom w:type="dxa" w:w="80"/>
-              <w:right w:type="dxa" w:w="100"/>
+            <w:tcW w:type="dxa" w:w="3471"/>
+            <w:tcMar>
+              <w:top w:type="dxa" w:w="100"/>
+              <w:left w:type="dxa" w:w="120"/>
+              <w:bottom w:type="dxa" w:w="100"/>
+              <w:right w:type="dxa" w:w="120"/>
             </w:tcMar>
           </w:tcPr>
           <w:p>
@@ -5372,12 +5144,12 @@
       <w:tr>
         <w:tc>
           <w:tcPr>
-            <w:tcW w:type="dxa" w:w="3000"/>
-            <w:tcMar>
-              <w:top w:type="dxa" w:w="80"/>
-              <w:left w:type="dxa" w:w="100"/>
-              <w:bottom w:type="dxa" w:w="80"/>
-              <w:right w:type="dxa" w:w="100"/>
+            <w:tcW w:type="dxa" w:w="1543"/>
+            <w:tcMar>
+              <w:top w:type="dxa" w:w="100"/>
+              <w:left w:type="dxa" w:w="120"/>
+              <w:bottom w:type="dxa" w:w="100"/>
+              <w:right w:type="dxa" w:w="120"/>
             </w:tcMar>
           </w:tcPr>
           <w:p>
@@ -5394,12 +5166,12 @@
         </w:tc>
         <w:tc>
           <w:tcPr>
-            <w:tcW w:type="dxa" w:w="3000"/>
-            <w:tcMar>
-              <w:top w:type="dxa" w:w="80"/>
-              <w:left w:type="dxa" w:w="100"/>
-              <w:bottom w:type="dxa" w:w="80"/>
-              <w:right w:type="dxa" w:w="100"/>
+            <w:tcW w:type="dxa" w:w="3986"/>
+            <w:tcMar>
+              <w:top w:type="dxa" w:w="100"/>
+              <w:left w:type="dxa" w:w="120"/>
+              <w:bottom w:type="dxa" w:w="100"/>
+              <w:right w:type="dxa" w:w="120"/>
             </w:tcMar>
           </w:tcPr>
           <w:p>
@@ -5416,12 +5188,12 @@
         </w:tc>
         <w:tc>
           <w:tcPr>
-            <w:tcW w:type="dxa" w:w="3000"/>
-            <w:tcMar>
-              <w:top w:type="dxa" w:w="80"/>
-              <w:left w:type="dxa" w:w="100"/>
-              <w:bottom w:type="dxa" w:w="80"/>
-              <w:right w:type="dxa" w:w="100"/>
+            <w:tcW w:type="dxa" w:w="3471"/>
+            <w:tcMar>
+              <w:top w:type="dxa" w:w="100"/>
+              <w:left w:type="dxa" w:w="120"/>
+              <w:bottom w:type="dxa" w:w="100"/>
+              <w:right w:type="dxa" w:w="120"/>
             </w:tcMar>
           </w:tcPr>
           <w:p>
@@ -5440,7 +5212,7 @@
     </w:tbl>
     <w:p>
       <w:pPr>
-        <w:spacing w:after="200"/>
+        <w:spacing w:after="160"/>
       </w:pPr>
     </w:p>
     <w:p>
@@ -5460,19 +5232,8 @@
     </w:p>
     <w:p>
       <w:pPr>
-        <w:pBdr>
-          <w:bottom w:val="single" w:color="C9A24B" w:sz="6"/>
-        </w:pBdr>
-        <w:spacing w:after="200" w:before="200"/>
-      </w:pPr>
-    </w:p>
-    <w:p>
-      <w:pPr>
         <w:pStyle w:val="Heading1"/>
-        <w:pBdr>
-          <w:bottom w:val="single" w:color="1A1A2E" w:sz="4"/>
-        </w:pBdr>
-        <w:spacing w:after="160" w:before="360"/>
+        <w:spacing w:after="160" w:before="400"/>
       </w:pPr>
       <w:r>
         <w:t xml:space="preserve">THE SECOND LOCATION</w:t>
@@ -5548,19 +5309,8 @@
     </w:p>
     <w:p>
       <w:pPr>
-        <w:pBdr>
-          <w:bottom w:val="single" w:color="C9A24B" w:sz="6"/>
-        </w:pBdr>
-        <w:spacing w:after="200" w:before="200"/>
-      </w:pPr>
-    </w:p>
-    <w:p>
-      <w:pPr>
         <w:pStyle w:val="Heading1"/>
-        <w:pBdr>
-          <w:bottom w:val="single" w:color="1A1A2E" w:sz="4"/>
-        </w:pBdr>
-        <w:spacing w:after="160" w:before="360"/>
+        <w:spacing w:after="160" w:before="400"/>
       </w:pPr>
       <w:r>
         <w:t xml:space="preserve">THE NORTH STAR</w:t>
@@ -5651,7 +5401,7 @@
         <w:pBdr>
           <w:bottom w:val="single" w:color="C9A24B" w:sz="6"/>
         </w:pBdr>
-        <w:spacing w:after="200" w:before="200"/>
+        <w:spacing w:after="160" w:before="160"/>
       </w:pPr>
     </w:p>
     <w:p>

</xml_diff>

<commit_message>
fix(marketing): align brand bible sourcing claims with actual sourcing decision
Daily sourcing is wild-caught Maine claw and knuckle, hand-cleaned
in-house (shell-on, cooked by the supplier, cleaned by hand at
Lobsteria). Whole/live lobster is used only occasionally, for content
that proves the standard — not as the nightly supply chain. No tail
menu items.

Removed or rewrote every claim that assumed daily whole-live-lobster
sourcing:
- "Most places use pre-cooked lobster meat. We don't." (was false;
  replaced with the true differentiator: hand-cleaned vs. pre-picked)
- "The whole live lobster arriving... every night" (was false; now
  scoped to occasional behind-the-scenes content)
- "We throw it out" re: tail (reframed — claw/knuckle-only sourcing
  means tail is never brought into the kitchen at all)
- Series 1 and Series 4 episode lists, the WHAT TO SHOOT table, and
  the Phase 2 viral-video plan updated to match

Applied to the .md, the .txt mirror, and regenerated the .docx.
</commit_message>
<xml_diff>
--- a/src/knowledge/marketing/Lobsteria-Social-Media-Brand-Bible.docx
+++ b/src/knowledge/marketing/Lobsteria-Social-Media-Brand-Bible.docx
@@ -39,7 +39,7 @@
           <w:sz w:val="20"/>
           <w:szCs w:val="20"/>
         </w:rPr>
-        <w:t xml:space="preserve">Last updated: May 2026. Written after studying @homerfoodgroup, @ganasdevicio, @grab.sandwiches, @myka_greek.usa</w:t>
+        <w:t xml:space="preserve">Last updated: August 2026. Written after studying @homerfoodgroup, @ganasdevicio, @grab.sandwiches, @myka_greek.usa</w:t>
       </w:r>
     </w:p>
     <w:p>
@@ -153,7 +153,7 @@
         <w:spacing w:after="160"/>
       </w:pPr>
       <w:r>
-        <w:t xml:space="preserve">That's not a marketing line. That's what he actually said. And that's what Lobsteria is: the answer to that sentence. Built from a vintage 1977 Airstream in Wynwood. Open every night until 2am. Pau at the window asking how your food is. The same music playing. The claw and the knuckle, hand-cleaned, made to order. Every single night.</w:t>
+        <w:t xml:space="preserve">That's not a marketing line. That's what he actually said. And that's what Lobsteria is: the answer to that sentence. Built from a vintage 1977 Airstream in Wynwood. Open every night until 2am. Pau at the window asking how your food is. The same music playing. Wild-caught Maine claw and knuckle, hand-cleaned in-house, made to order. Every single night.</w:t>
       </w:r>
     </w:p>
     <w:p>
@@ -642,7 +642,7 @@
         <w:spacing w:after="60"/>
       </w:pPr>
       <w:r>
-        <w:t xml:space="preserve">Pau's hands cleaning a whole lobster. No talking. Just the process. Music playing.</w:t>
+        <w:t xml:space="preserve">Pau's hands cracking and cleaning claw and knuckle. No talking. Just the process. Music playing.</w:t>
       </w:r>
     </w:p>
     <w:p>
@@ -668,7 +668,20 @@
         <w:spacing w:after="60"/>
       </w:pPr>
       <w:r>
-        <w:t xml:space="preserve">The lobster delivery arriving. "This is what we start with every night."</w:t>
+        <w:t xml:space="preserve">Wild-caught Maine claw and knuckle, hand-cleaned in-house — cracked, picked, and cleaned by hand, every single night.</w:t>
+      </w:r>
+    </w:p>
+    <w:p>
+      <w:pPr>
+        <w:pStyle w:val="ListParagraph"/>
+        <w:numPr>
+          <w:ilvl w:val="0"/>
+          <w:numId w:val="2"/>
+        </w:numPr>
+        <w:spacing w:after="60"/>
+      </w:pPr>
+      <w:r>
+        <w:t xml:space="preserve">Occasionally: a whole lobster, live, cooked and broken down on camera — the same standard, shown from the very beginning. (Behind-the-scenes. Not nightly sourcing — a look at where the standard comes from.)</w:t>
       </w:r>
     </w:p>
     <w:p>
@@ -1538,20 +1551,33 @@
         <w:spacing w:after="60"/>
       </w:pPr>
       <w:r>
-        <w:t xml:space="preserve">"Why we don't use the tail." [Shows the claw vs. tail — quality difference]</w:t>
-      </w:r>
-    </w:p>
-    <w:p>
-      <w:pPr>
-        <w:pStyle w:val="ListParagraph"/>
-        <w:numPr>
-          <w:ilvl w:val="0"/>
-          <w:numId w:val="2"/>
-        </w:numPr>
-        <w:spacing w:after="60"/>
-      </w:pPr>
-      <w:r>
-        <w:t xml:space="preserve">"This is what hand-cleaning actually means." [The full process, one lobster]</w:t>
+        <w:t xml:space="preserve">"Why we don't use the tail." [Claw and knuckle only — why this cut, every night]</w:t>
+      </w:r>
+    </w:p>
+    <w:p>
+      <w:pPr>
+        <w:pStyle w:val="ListParagraph"/>
+        <w:numPr>
+          <w:ilvl w:val="0"/>
+          <w:numId w:val="2"/>
+        </w:numPr>
+        <w:spacing w:after="60"/>
+      </w:pPr>
+      <w:r>
+        <w:t xml:space="preserve">"This is what hand-cleaning actually means." [Claw and knuckle, cracked and picked by hand — the nightly process]</w:t>
+      </w:r>
+    </w:p>
+    <w:p>
+      <w:pPr>
+        <w:pStyle w:val="ListParagraph"/>
+        <w:numPr>
+          <w:ilvl w:val="0"/>
+          <w:numId w:val="2"/>
+        </w:numPr>
+        <w:spacing w:after="60"/>
+      </w:pPr>
+      <w:r>
+        <w:t xml:space="preserve">"Starting from the whole lobster." [Occasional behind-the-scenes: live lobster, cooked and broken down on camera, same standard from the very beginning]</w:t>
       </w:r>
     </w:p>
     <w:p>
@@ -1829,7 +1855,7 @@
         <w:spacing w:after="60"/>
       </w:pPr>
       <w:r>
-        <w:t xml:space="preserve">"Most places use pre-cooked lobster meat. We don't." [Shows the whole live/fresh lobster arriving]</w:t>
+        <w:t xml:space="preserve">"Most places buy pre-picked, machine-processed lobster meat. We hand-clean every claw and knuckle ourselves." [Shows the cracking and picking process]</w:t>
       </w:r>
     </w:p>
     <w:p>
@@ -1855,7 +1881,7 @@
         <w:spacing w:after="60"/>
       </w:pPr>
       <w:r>
-        <w:t xml:space="preserve">"Most rolls use the tail. We throw it out." [The claw + knuckle standard]</w:t>
+        <w:t xml:space="preserve">"Most rolls use the tail. We don't even bring it into the kitchen." [Claw and knuckle only, always]</w:t>
       </w:r>
     </w:p>
     <w:p>
@@ -3093,7 +3119,7 @@
         <w:spacing w:after="160"/>
       </w:pPr>
       <w:r>
-        <w:t xml:space="preserve">The hand-cleaning video will be this moment. It needs to be shot and executed perfectly:</w:t>
+        <w:t xml:space="preserve">The hand-cleaning video will be this moment. Filmed during one of the periodic whole-lobster sessions — not nightly sourcing, but real, on camera, once. It needs to be shot and executed perfectly:</w:t>
       </w:r>
     </w:p>
     <w:p>
@@ -3452,9 +3478,9 @@
       </w:tblPr>
       <w:tblGrid>
         <w:gridCol w:w="1300"/>
-        <w:gridCol w:w="4938"/>
+        <w:gridCol w:w="4617"/>
         <w:gridCol w:w="1300"/>
-        <w:gridCol w:w="1462"/>
+        <w:gridCol w:w="1783"/>
       </w:tblGrid>
       <w:tr>
         <w:tc>
@@ -3483,7 +3509,7 @@
         </w:tc>
         <w:tc>
           <w:tcPr>
-            <w:tcW w:type="dxa" w:w="4938"/>
+            <w:tcW w:type="dxa" w:w="4617"/>
             <w:shd w:fill="1A1A2E" w:color="auto" w:val="clear"/>
             <w:tcMar>
               <w:top w:type="dxa" w:w="100"/>
@@ -3531,7 +3557,7 @@
         </w:tc>
         <w:tc>
           <w:tcPr>
-            <w:tcW w:type="dxa" w:w="1462"/>
+            <w:tcW w:type="dxa" w:w="1783"/>
             <w:shd w:fill="1A1A2E" w:color="auto" w:val="clear"/>
             <w:tcMar>
               <w:top w:type="dxa" w:w="100"/>
@@ -3579,23 +3605,23 @@
         </w:tc>
         <w:tc>
           <w:tcPr>
-            <w:tcW w:type="dxa" w:w="4938"/>
-            <w:tcMar>
-              <w:top w:type="dxa" w:w="100"/>
-              <w:left w:type="dxa" w:w="120"/>
-              <w:bottom w:type="dxa" w:w="100"/>
-              <w:right w:type="dxa" w:w="120"/>
-            </w:tcMar>
-          </w:tcPr>
-          <w:p>
-            <w:r>
-              <w:rPr>
-                <w:b w:val="false"/>
-                <w:bCs w:val="false"/>
-                <w:sz w:val="20"/>
-                <w:szCs w:val="20"/>
-              </w:rPr>
-              <w:t xml:space="preserve">Pau hand-cleaning a whole lobster</w:t>
+            <w:tcW w:type="dxa" w:w="4617"/>
+            <w:tcMar>
+              <w:top w:type="dxa" w:w="100"/>
+              <w:left w:type="dxa" w:w="120"/>
+              <w:bottom w:type="dxa" w:w="100"/>
+              <w:right w:type="dxa" w:w="120"/>
+            </w:tcMar>
+          </w:tcPr>
+          <w:p>
+            <w:r>
+              <w:rPr>
+                <w:b w:val="false"/>
+                <w:bCs w:val="false"/>
+                <w:sz w:val="20"/>
+                <w:szCs w:val="20"/>
+              </w:rPr>
+              <w:t xml:space="preserve">Pau hand-cleaning a whole lobster (occasional session — the flagship shoot)</w:t>
             </w:r>
           </w:p>
         </w:tc>
@@ -3623,7 +3649,7 @@
         </w:tc>
         <w:tc>
           <w:tcPr>
-            <w:tcW w:type="dxa" w:w="1462"/>
+            <w:tcW w:type="dxa" w:w="1783"/>
             <w:tcMar>
               <w:top w:type="dxa" w:w="100"/>
               <w:left w:type="dxa" w:w="120"/>
@@ -3669,7 +3695,7 @@
         </w:tc>
         <w:tc>
           <w:tcPr>
-            <w:tcW w:type="dxa" w:w="4938"/>
+            <w:tcW w:type="dxa" w:w="4617"/>
             <w:tcMar>
               <w:top w:type="dxa" w:w="100"/>
               <w:left w:type="dxa" w:w="120"/>
@@ -3713,7 +3739,7 @@
         </w:tc>
         <w:tc>
           <w:tcPr>
-            <w:tcW w:type="dxa" w:w="1462"/>
+            <w:tcW w:type="dxa" w:w="1783"/>
             <w:tcMar>
               <w:top w:type="dxa" w:w="100"/>
               <w:left w:type="dxa" w:w="120"/>
@@ -3759,7 +3785,7 @@
         </w:tc>
         <w:tc>
           <w:tcPr>
-            <w:tcW w:type="dxa" w:w="4938"/>
+            <w:tcW w:type="dxa" w:w="4617"/>
             <w:tcMar>
               <w:top w:type="dxa" w:w="100"/>
               <w:left w:type="dxa" w:w="120"/>
@@ -3803,7 +3829,7 @@
         </w:tc>
         <w:tc>
           <w:tcPr>
-            <w:tcW w:type="dxa" w:w="1462"/>
+            <w:tcW w:type="dxa" w:w="1783"/>
             <w:tcMar>
               <w:top w:type="dxa" w:w="100"/>
               <w:left w:type="dxa" w:w="120"/>
@@ -3849,7 +3875,7 @@
         </w:tc>
         <w:tc>
           <w:tcPr>
-            <w:tcW w:type="dxa" w:w="4938"/>
+            <w:tcW w:type="dxa" w:w="4617"/>
             <w:tcMar>
               <w:top w:type="dxa" w:w="100"/>
               <w:left w:type="dxa" w:w="120"/>
@@ -3893,7 +3919,7 @@
         </w:tc>
         <w:tc>
           <w:tcPr>
-            <w:tcW w:type="dxa" w:w="1462"/>
+            <w:tcW w:type="dxa" w:w="1783"/>
             <w:tcMar>
               <w:top w:type="dxa" w:w="100"/>
               <w:left w:type="dxa" w:w="120"/>
@@ -3939,7 +3965,7 @@
         </w:tc>
         <w:tc>
           <w:tcPr>
-            <w:tcW w:type="dxa" w:w="4938"/>
+            <w:tcW w:type="dxa" w:w="4617"/>
             <w:tcMar>
               <w:top w:type="dxa" w:w="100"/>
               <w:left w:type="dxa" w:w="120"/>
@@ -3983,7 +4009,7 @@
         </w:tc>
         <w:tc>
           <w:tcPr>
-            <w:tcW w:type="dxa" w:w="1462"/>
+            <w:tcW w:type="dxa" w:w="1783"/>
             <w:tcMar>
               <w:top w:type="dxa" w:w="100"/>
               <w:left w:type="dxa" w:w="120"/>
@@ -4029,23 +4055,23 @@
         </w:tc>
         <w:tc>
           <w:tcPr>
-            <w:tcW w:type="dxa" w:w="4938"/>
-            <w:tcMar>
-              <w:top w:type="dxa" w:w="100"/>
-              <w:left w:type="dxa" w:w="120"/>
-              <w:bottom w:type="dxa" w:w="100"/>
-              <w:right w:type="dxa" w:w="120"/>
-            </w:tcMar>
-          </w:tcPr>
-          <w:p>
-            <w:r>
-              <w:rPr>
-                <w:b w:val="false"/>
-                <w:bCs w:val="false"/>
-                <w:sz w:val="20"/>
-                <w:szCs w:val="20"/>
-              </w:rPr>
-              <w:t xml:space="preserve">Lobster delivery arriving — the whole live lobster</w:t>
+            <w:tcW w:type="dxa" w:w="4617"/>
+            <w:tcMar>
+              <w:top w:type="dxa" w:w="100"/>
+              <w:left w:type="dxa" w:w="120"/>
+              <w:bottom w:type="dxa" w:w="100"/>
+              <w:right w:type="dxa" w:w="120"/>
+            </w:tcMar>
+          </w:tcPr>
+          <w:p>
+            <w:r>
+              <w:rPr>
+                <w:b w:val="false"/>
+                <w:bCs w:val="false"/>
+                <w:sz w:val="20"/>
+                <w:szCs w:val="20"/>
+              </w:rPr>
+              <w:t xml:space="preserve">Occasional whole-lobster cook + breakdown (behind-the-scenes, not nightly)</w:t>
             </w:r>
           </w:p>
         </w:tc>
@@ -4073,23 +4099,23 @@
         </w:tc>
         <w:tc>
           <w:tcPr>
-            <w:tcW w:type="dxa" w:w="1462"/>
-            <w:tcMar>
-              <w:top w:type="dxa" w:w="100"/>
-              <w:left w:type="dxa" w:w="120"/>
-              <w:bottom w:type="dxa" w:w="100"/>
-              <w:right w:type="dxa" w:w="120"/>
-            </w:tcMar>
-          </w:tcPr>
-          <w:p>
-            <w:r>
-              <w:rPr>
-                <w:b w:val="false"/>
-                <w:bCs w:val="false"/>
-                <w:sz w:val="20"/>
-                <w:szCs w:val="20"/>
-              </w:rPr>
-              <w:t xml:space="preserve">The Standard #2</w:t>
+            <w:tcW w:type="dxa" w:w="1783"/>
+            <w:tcMar>
+              <w:top w:type="dxa" w:w="100"/>
+              <w:left w:type="dxa" w:w="120"/>
+              <w:bottom w:type="dxa" w:w="100"/>
+              <w:right w:type="dxa" w:w="120"/>
+            </w:tcMar>
+          </w:tcPr>
+          <w:p>
+            <w:r>
+              <w:rPr>
+                <w:b w:val="false"/>
+                <w:bCs w:val="false"/>
+                <w:sz w:val="20"/>
+                <w:szCs w:val="20"/>
+              </w:rPr>
+              <w:t xml:space="preserve">The Standard — occasional</w:t>
             </w:r>
           </w:p>
         </w:tc>
@@ -4119,7 +4145,7 @@
         </w:tc>
         <w:tc>
           <w:tcPr>
-            <w:tcW w:type="dxa" w:w="4938"/>
+            <w:tcW w:type="dxa" w:w="4617"/>
             <w:tcMar>
               <w:top w:type="dxa" w:w="100"/>
               <w:left w:type="dxa" w:w="120"/>
@@ -4163,7 +4189,7 @@
         </w:tc>
         <w:tc>
           <w:tcPr>
-            <w:tcW w:type="dxa" w:w="1462"/>
+            <w:tcW w:type="dxa" w:w="1783"/>
             <w:tcMar>
               <w:top w:type="dxa" w:w="100"/>
               <w:left w:type="dxa" w:w="120"/>
@@ -4209,7 +4235,7 @@
         </w:tc>
         <w:tc>
           <w:tcPr>
-            <w:tcW w:type="dxa" w:w="4938"/>
+            <w:tcW w:type="dxa" w:w="4617"/>
             <w:tcMar>
               <w:top w:type="dxa" w:w="100"/>
               <w:left w:type="dxa" w:w="120"/>
@@ -4253,7 +4279,7 @@
         </w:tc>
         <w:tc>
           <w:tcPr>
-            <w:tcW w:type="dxa" w:w="1462"/>
+            <w:tcW w:type="dxa" w:w="1783"/>
             <w:tcMar>
               <w:top w:type="dxa" w:w="100"/>
               <w:left w:type="dxa" w:w="120"/>
@@ -4299,7 +4325,7 @@
         </w:tc>
         <w:tc>
           <w:tcPr>
-            <w:tcW w:type="dxa" w:w="4938"/>
+            <w:tcW w:type="dxa" w:w="4617"/>
             <w:tcMar>
               <w:top w:type="dxa" w:w="100"/>
               <w:left w:type="dxa" w:w="120"/>
@@ -4343,7 +4369,7 @@
         </w:tc>
         <w:tc>
           <w:tcPr>
-            <w:tcW w:type="dxa" w:w="1462"/>
+            <w:tcW w:type="dxa" w:w="1783"/>
             <w:tcMar>
               <w:top w:type="dxa" w:w="100"/>
               <w:left w:type="dxa" w:w="120"/>
@@ -4389,7 +4415,7 @@
         </w:tc>
         <w:tc>
           <w:tcPr>
-            <w:tcW w:type="dxa" w:w="4938"/>
+            <w:tcW w:type="dxa" w:w="4617"/>
             <w:tcMar>
               <w:top w:type="dxa" w:w="100"/>
               <w:left w:type="dxa" w:w="120"/>
@@ -4433,7 +4459,7 @@
         </w:tc>
         <w:tc>
           <w:tcPr>
-            <w:tcW w:type="dxa" w:w="1462"/>
+            <w:tcW w:type="dxa" w:w="1783"/>
             <w:tcMar>
               <w:top w:type="dxa" w:w="100"/>
               <w:left w:type="dxa" w:w="120"/>
@@ -4479,7 +4505,7 @@
         </w:tc>
         <w:tc>
           <w:tcPr>
-            <w:tcW w:type="dxa" w:w="4938"/>
+            <w:tcW w:type="dxa" w:w="4617"/>
             <w:tcMar>
               <w:top w:type="dxa" w:w="100"/>
               <w:left w:type="dxa" w:w="120"/>
@@ -4523,7 +4549,7 @@
         </w:tc>
         <w:tc>
           <w:tcPr>
-            <w:tcW w:type="dxa" w:w="1462"/>
+            <w:tcW w:type="dxa" w:w="1783"/>
             <w:tcMar>
               <w:top w:type="dxa" w:w="100"/>
               <w:left w:type="dxa" w:w="120"/>
@@ -5425,7 +5451,7 @@
           <w:i/>
           <w:iCs/>
         </w:rPr>
-        <w:t xml:space="preserve">Last reviewed: May 2026</w:t>
+        <w:t xml:space="preserve">Last reviewed: August 2026</w:t>
       </w:r>
     </w:p>
     <w:p>
@@ -5437,7 +5463,7 @@
           <w:i/>
           <w:iCs/>
         </w:rPr>
-        <w:t xml:space="preserve">Next review: September 2026</w:t>
+        <w:t xml:space="preserve">Next review: November 2026</w:t>
       </w:r>
     </w:p>
     <w:sectPr>

</xml_diff>